<commit_message>
feat: transliterate all Sanskrit words and names in English prose to IAST, fix spelling of bhanaktu to bhunaktu
</commit_message>
<xml_diff>
--- a/katopanishad-english.docx
+++ b/katopanishad-english.docx
@@ -22,7 +22,7 @@
         <w:jc w:val="left"/>
       </w:pPr>
       <w:r>
-        <w:t>Katha Upanishad</w:t>
+        <w:t>Katha Upaniṣad</w:t>
       </w:r>
     </w:p>
     <w:p>
@@ -46,7 +46,7 @@
         <w:jc w:val="left"/>
       </w:pPr>
       <w:r>
-        <w:t>[For those who wish to know the truth truly in today's social life, the Kathakopanishad is very helpful. It is difficult today to determine whether the matters described in Indian philosophy — suprasensory objects, the subtle world invisible to the eye, the experiences of happiness and sorrow there, the soul that travels from the earthly world to that realm to experience them, the God who controls that soul — are true or false. The Upanishad set aside exclusively for this inquiry is the Kathakopanishad. Does God govern us only within the cycle of worldly life, or does His control extend even into liberation? What is the condition of the soul that has attained liberation? What happens after liberation? These and similar questions are answered by the Kathakopanishad.</w:t>
+        <w:t>[For those who wish to know the truth truly in today's social life, the Kāṭhakopaniṣad is very helpful. It is difficult today to determine whether the matters described in Indian philosophy — suprasensory objects, the subtle world invisible to the eye, the experiences of happiness and sorrow there, the soul that travels from the earthly world to that realm to experience them, the God who controls that soul — are true or false. The Upaniṣad set aside exclusively for this inquiry is the Kāṭhakopaniṣad. Does God govern us only within the cycle of worldly life, or does His control extend even into liberation? What is the condition of the soul that has attained liberation? What happens after liberation? These and similar questions are answered by the Kāṭhakopaniṣad.</w:t>
       </w:r>
     </w:p>
     <w:p>
@@ -55,7 +55,7 @@
         <w:jc w:val="left"/>
       </w:pPr>
       <w:r>
-        <w:t>This is a small effort to capture the essence of meaning of the Katha Upanishad, as expounded by the venerable Bannanje Govindacharya in his Upanishad discourses, and present it in e-book form to reach interested devotees.]</w:t>
+        <w:t>This is a small effort to capture the essence of meaning of the Katha Upaniṣad, as expounded by the venerable Bannanje Govindacharya in his Upaniṣad discourses, and present it in e-book form to reach interested devotees.]</w:t>
       </w:r>
     </w:p>
     <w:p>
@@ -137,7 +137,7 @@
         <w:jc w:val="left"/>
       </w:pPr>
       <w:r>
-        <w:t>Valli 1......................................................................................................................... 7</w:t>
+        <w:t>Vallī 1......................................................................................................................... 7</w:t>
       </w:r>
     </w:p>
     <w:p>
@@ -146,7 +146,7 @@
         <w:jc w:val="left"/>
       </w:pPr>
       <w:r>
-        <w:t>Valli 2....................................................................................................................... 28</w:t>
+        <w:t>Vallī 2....................................................................................................................... 28</w:t>
       </w:r>
     </w:p>
     <w:p>
@@ -155,7 +155,7 @@
         <w:jc w:val="left"/>
       </w:pPr>
       <w:r>
-        <w:t>Valli 3....................................................................................................................... 39</w:t>
+        <w:t>Vallī 3....................................................................................................................... 39</w:t>
       </w:r>
     </w:p>
     <w:p>
@@ -173,7 +173,7 @@
         <w:jc w:val="left"/>
       </w:pPr>
       <w:r>
-        <w:t>Valli 01...................................................................................................................... 47</w:t>
+        <w:t>Vallī 01...................................................................................................................... 47</w:t>
       </w:r>
     </w:p>
     <w:p>
@@ -182,7 +182,7 @@
         <w:jc w:val="left"/>
       </w:pPr>
       <w:r>
-        <w:t>Valli 02...................................................................................................................... 57</w:t>
+        <w:t>Vallī 02...................................................................................................................... 57</w:t>
       </w:r>
     </w:p>
     <w:p>
@@ -191,7 +191,7 @@
         <w:jc w:val="left"/>
       </w:pPr>
       <w:r>
-        <w:t>Valli 03...................................................................................................................... 66</w:t>
+        <w:t>Vallī 03...................................................................................................................... 66</w:t>
       </w:r>
     </w:p>
     <w:p>
@@ -209,7 +209,7 @@
         <w:jc w:val="left"/>
       </w:pPr>
       <w:r>
-        <w:t>Katha Upanishad — Kannada Verse Form......................................................................... 77</w:t>
+        <w:t>Katha Upaniṣad — Kannada Verse Form......................................................................... 77</w:t>
       </w:r>
     </w:p>
     <w:p>
@@ -236,7 +236,7 @@
         <w:jc w:val="left"/>
       </w:pPr>
       <w:r>
-        <w:t>Valli 1................................................................................................................... 79</w:t>
+        <w:t>Vallī 1................................................................................................................... 79</w:t>
       </w:r>
     </w:p>
     <w:p>
@@ -245,7 +245,7 @@
         <w:jc w:val="left"/>
       </w:pPr>
       <w:r>
-        <w:t>Valli 2................................................................................................................... 98</w:t>
+        <w:t>Vallī 2................................................................................................................... 98</w:t>
       </w:r>
     </w:p>
     <w:p>
@@ -254,7 +254,7 @@
         <w:jc w:val="left"/>
       </w:pPr>
       <w:r>
-        <w:t>Valli 3................................................................................................................. 112</w:t>
+        <w:t>Vallī 3................................................................................................................. 112</w:t>
       </w:r>
     </w:p>
     <w:p>
@@ -272,7 +272,7 @@
         <w:jc w:val="left"/>
       </w:pPr>
       <w:r>
-        <w:t>Valli 01................................................................................................................ 121</w:t>
+        <w:t>Vallī 01................................................................................................................ 121</w:t>
       </w:r>
     </w:p>
     <w:p>
@@ -281,7 +281,7 @@
         <w:jc w:val="left"/>
       </w:pPr>
       <w:r>
-        <w:t>Valli 02................................................................................................................ 132</w:t>
+        <w:t>Vallī 02................................................................................................................ 132</w:t>
       </w:r>
     </w:p>
     <w:p>
@@ -290,7 +290,7 @@
         <w:jc w:val="left"/>
       </w:pPr>
       <w:r>
-        <w:t>Valli 03................................................................................................................ 142</w:t>
+        <w:t>Vallī 03................................................................................................................ 142</w:t>
       </w:r>
     </w:p>
     <w:p>
@@ -308,7 +308,7 @@
         <w:jc w:val="left"/>
       </w:pPr>
       <w:r>
-        <w:t>Katha Upanishad — Original Shlokas............................................................................ 155</w:t>
+        <w:t>Katha Upaniṣad — Original Ślokas............................................................................ 155</w:t>
       </w:r>
     </w:p>
     <w:p>
@@ -326,7 +326,7 @@
         <w:jc w:val="left"/>
       </w:pPr>
       <w:r>
-        <w:t>Valli 1................................................................................................................. 155</w:t>
+        <w:t>Vallī 1................................................................................................................. 155</w:t>
       </w:r>
     </w:p>
     <w:p>
@@ -340,7 +340,7 @@
           <w:i/>
           <w:sz w:val="19"/>
         </w:rPr>
-        <w:t>Source: Bannanje Govindacharya's Upanishad Discourses                                           Page 1</w:t>
+        <w:t>Source: Bannanje Govindacharya's Upaniṣad Discourses                                           Page 1</w:t>
       </w:r>
     </w:p>
     <w:p>
@@ -377,7 +377,7 @@
         <w:jc w:val="left"/>
       </w:pPr>
       <w:r>
-        <w:t>Valli 2................................................................................................................. 159</w:t>
+        <w:t>Vallī 2................................................................................................................. 159</w:t>
       </w:r>
     </w:p>
     <w:p>
@@ -386,7 +386,7 @@
         <w:jc w:val="left"/>
       </w:pPr>
       <w:r>
-        <w:t>Valli 3................................................................................................................. 162</w:t>
+        <w:t>Vallī 3................................................................................................................. 162</w:t>
       </w:r>
     </w:p>
     <w:p>
@@ -404,7 +404,7 @@
         <w:jc w:val="left"/>
       </w:pPr>
       <w:r>
-        <w:t>Valli 01.................................................................................................................... 164</w:t>
+        <w:t>Vallī 01.................................................................................................................... 164</w:t>
       </w:r>
     </w:p>
     <w:p>
@@ -413,7 +413,7 @@
         <w:jc w:val="left"/>
       </w:pPr>
       <w:r>
-        <w:t>Valli 02.................................................................................................................... 166</w:t>
+        <w:t>Vallī 02.................................................................................................................... 166</w:t>
       </w:r>
     </w:p>
     <w:p>
@@ -422,7 +422,7 @@
         <w:jc w:val="left"/>
       </w:pPr>
       <w:r>
-        <w:t>Valli 3..................................................................................................................... 168</w:t>
+        <w:t>Vallī 3..................................................................................................................... 168</w:t>
       </w:r>
     </w:p>
     <w:p>
@@ -436,7 +436,7 @@
           <w:i/>
           <w:sz w:val="19"/>
         </w:rPr>
-        <w:t>Source: Bannanje Govindacharya's Upanishad Discourses                                           Page 2</w:t>
+        <w:t>Source: Bannanje Govindacharya's Upaniṣad Discourses                                           Page 2</w:t>
       </w:r>
     </w:p>
     <w:p>
@@ -473,7 +473,7 @@
         <w:jc w:val="left"/>
       </w:pPr>
       <w:r>
-        <w:t>Using the audio recordings of the 'Upanishad Discourses' delivered by the venerable Bannanje Govindacharya in a manner comprehensible to an ordinary person, the detailed explanation of each shloka has been presented here. Readers are requested here to first listen to the audio recordings of Acharya's discourses if possible. This has been written for the benefit of those spiritual companions who are unable to listen to the audio recordings, so that they may come to know this rare wealth of meaning presented here, and we pray that they sanctify their lives.</w:t>
+        <w:t>Using the audio recordings of the 'Upaniṣad Discourses' delivered by the venerable Bannanje Govindacharya in a manner comprehensible to an ordinary person, the detailed explanation of each śloka has been presented here. Readers are requested here to first listen to the audio recordings of Acharya's discourses if possible. This has been written for the benefit of those spiritual companions who are unable to listen to the audio recordings, so that they may come to know this rare wealth of meaning presented here, and we pray that they sanctify their lives.</w:t>
       </w:r>
     </w:p>
     <w:p>
@@ -514,7 +514,7 @@
           <w:i/>
           <w:sz w:val="19"/>
         </w:rPr>
-        <w:t>Source: Bannanje Govindacharya's Upanishad Discourses                                           Page 3</w:t>
+        <w:t>Source: Bannanje Govindacharya's Upaniṣad Discourses                                           Page 3</w:t>
       </w:r>
     </w:p>
     <w:p>
@@ -551,7 +551,7 @@
         <w:jc w:val="left"/>
       </w:pPr>
       <w:r>
-        <w:t>This Kathakopanishad is a very famous Upanishad, belonging to the Katha branch of the Krishna Yajurveda, which came into practice through the lineage of the sage named 'Katha'. While the family lineage that preserved this Upanishad is that of the sage named 'Katha', the true seers (rishis) of this Upanishad are Yama and Nachiketa. The Kathakopanishad is the teaching (answer/instruction) that Yama gives to the questions posed by Nachiketa as a disciple.</w:t>
+        <w:t>This Kāṭhakopaniṣad is a very famous Upaniṣad, belonging to the Katha branch of the Krishna Yajurveda, which came into practice through the lineage of the sage named 'Katha'. While the family lineage that preserved this Upaniṣad is that of the sage named 'Katha', the true seers (ṛṣis) of this Upaniṣad are Yama and Naciketā. The Kāṭhakopaniṣad is the teaching (answer/instruction) that Yama gives to the questions posed by Naciketā as a disciple.</w:t>
       </w:r>
     </w:p>
     <w:p>
@@ -560,7 +560,7 @@
         <w:jc w:val="left"/>
       </w:pPr>
       <w:r>
-        <w:t>The name 'Katha' may seem very strange to us today. This is the name of a Vedic-era sage. Today the names of Vedic-era sages are no longer in common usage. Though this name that seems strange to hear is very meaningful, it seems strange to us because we do not know the meaning behind that name. This word is derived from the Sanskrit root 'Katha'. 'Katha' means one who labours and toils in life. For us to understand this Upanishad, we too must become a little 'Katha' — we must study with determination and effort, with the resolve that we must understand.</w:t>
+        <w:t>The name 'Katha' may seem very strange to us today. This is the name of a Vedic-era sage. Today the names of Vedic-era sages are no longer in common usage. Though this name that seems strange to hear is very meaningful, it seems strange to us because we do not know the meaning behind that name. This word is derived from the Sanskrit root 'Katha'. 'Katha' means one who labours and toils in life. For us to understand this Upaniṣad, we too must become a little 'Katha' — we must study with determination and effort, with the resolve that we must understand.</w:t>
       </w:r>
     </w:p>
     <w:p>
@@ -569,7 +569,7 @@
         <w:jc w:val="left"/>
       </w:pPr>
       <w:r>
-        <w:t>For those who wish to know the truth truly in today's social life, the Kathakopanishad is very helpful. It is difficult today to determine whether the matters described in Indian philosophy — suprasensory objects, the subtle world invisible to the eye, the experiences of happiness and sorrow there, the soul that travels from the earthly world to that realm to experience them, the God who controls that soul — are true or false. The Upanishad set aside exclusively for this inquiry is the Kathakopanishad.</w:t>
+        <w:t>For those who wish to know the truth truly in today's social life, the Kāṭhakopaniṣad is very helpful. It is difficult today to determine whether the matters described in Indian philosophy — suprasensory objects, the subtle world invisible to the eye, the experiences of happiness and sorrow there, the soul that travels from the earthly world to that realm to experience them, the God who controls that soul — are true or false. The Upaniṣad set aside exclusively for this inquiry is the Kāṭhakopaniṣad.</w:t>
       </w:r>
     </w:p>
     <w:p>
@@ -578,7 +578,7 @@
         <w:jc w:val="left"/>
       </w:pPr>
       <w:r>
-        <w:t>The unique feature of this Upanishad is that the one giving answers here is Yama. Yama exists only if the other world exists. It is a small boy from the earthly world who poses questions to Yama, who knows the existence of the subtle world and its experiences of happiness and sorrow. The principal deity propounded in this Upanishad is the Lord who is the controller of liberation. Does God govern us only in worldly life, or does His control extend even into liberation? What is the condition of the soul that has attained liberation? What happens after liberation? These are Nachiketa's important questions. The Kathakopanishad is Yama's answer to the innocent boy's questions.</w:t>
+        <w:t>The unique feature of this Upaniṣad is that the one giving answers here is Yama. Yama exists only if the other world exists. It is a small boy from the earthly world who poses questions to Yama, who knows the existence of the subtle world and its experiences of happiness and sorrow. The principal deity propounded in this Upaniṣad is the Lord who is the controller of liberation. Does God govern us only in worldly life, or does His control extend even into liberation? What is the condition of the soul that has attained liberation? What happens after liberation? These are Naciketā's important questions. The Kāṭhakopaniṣad is Yama's answer to the innocent boy's questions.</w:t>
       </w:r>
     </w:p>
     <w:p>
@@ -592,7 +592,7 @@
           <w:i/>
           <w:sz w:val="19"/>
         </w:rPr>
-        <w:t>Source: Bannanje Govindacharya's Upanishad Discourses                                           Page 4</w:t>
+        <w:t>Source: Bannanje Govindacharya's Upaniṣad Discourses                                           Page 4</w:t>
       </w:r>
     </w:p>
     <w:p>
@@ -620,7 +620,7 @@
         <w:jc w:val="left"/>
       </w:pPr>
       <w:r>
-        <w:t>The name of the boy asking questions here is 'Nachiketa'. The meaning of the word Nachiketa — na kincit chetah iti Nachiketa — means one who has not done anything! You may be surprised to hear this meaning. Why did Yama give instruction to one who had done nothing? To find the answer to this question we must understand Nachiketa's background. Vajashravasa's daughter was Aruna. Nachiketa was born in the sage family of Uddhalaka, the son of Aruna. Uddhalaka was a great scholar. But he could not fully give up the desire, anger, and attachment in his mind — he was greedy. Because of this he committed errors. He had two sons: the elder was Shvetaketu and the second was Nachiketa. When young, Nachiketa was very silent. Because of this his parents did not recognise the development within him. Thinking him as one who had done nothing, they did not send him to the gurukula but kept him at home. Nachiketa, deprived of education, served his parents at home. This same Nachiketa is the one sage of this Upanishad, and the other sage who gave instruction is the king Yama, another sage.</w:t>
+        <w:t>The name of the boy asking questions here is 'Naciketā'. The meaning of the word Naciketā — na kincit chetah iti Naciketā — means one who has not done anything! You may be surprised to hear this meaning. Why did Yama give instruction to one who had done nothing? To find the answer to this question we must understand Naciketā's background. Vājaśravasa's daughter was Aruṇā. Naciketā was born in the sage family of Uddālaka, the son of Aruṇā. Uddālaka was a great scholar. But he could not fully give up the desire, anger, and attachment in his mind — he was greedy. Because of this he committed errors. He had two sons: the elder was Śvetaketu and the second was Naciketā. When young, Naciketā was very silent. Because of this his parents did not recognise the development within him. Thinking him as one who had done nothing, they did not send him to the gurukula but kept him at home. Naciketā, deprived of education, served his parents at home. This same Naciketā is the one sage of this Upaniṣad, and the other sage who gave instruction is the king Yama, another sage.</w:t>
       </w:r>
     </w:p>
     <w:p>
@@ -643,7 +643,7 @@
           <w:i/>
           <w:sz w:val="19"/>
         </w:rPr>
-        <w:t>Source: Bannanje Govindacharya's Upanishad Discourses                                           Page 5</w:t>
+        <w:t>Source: Bannanje Govindacharya's Upaniṣad Discourses                                           Page 5</w:t>
       </w:r>
     </w:p>
     <w:p>
@@ -662,7 +662,7 @@
           <w:b/>
           <w:sz w:val="26"/>
         </w:rPr>
-        <w:t>[PAGE 7 - PEACE INVOCATION (Shanti Patha)]</w:t>
+        <w:t>[PAGE 7 - PEACE INVOCATION (Śānti Patha)]</w:t>
       </w:r>
     </w:p>
     <w:p>
@@ -773,7 +773,7 @@
         <w:jc w:val="left"/>
       </w:pPr>
       <w:r>
-        <w:t>'Saha nau avatu': Here 'avatu' from 'ava' means to enter. "O Lord, enter into my teacher and fill them with the power to teach. Enter into me so that the teacher's words become comprehensible to me."</w:t>
+        <w:t>'saha nau avatu': Here 'avatu' from 'ava' means to enter. "O Lord, enter into my teacher and fill them with the power to teach. Enter into me so that the teacher's words become comprehensible to me."</w:t>
       </w:r>
     </w:p>
     <w:p>
@@ -782,7 +782,7 @@
         <w:jc w:val="left"/>
       </w:pPr>
       <w:r>
-        <w:t>'Saha nau bhanaktu': 'Bhanaktu' means to nourish or to feed. "O Lord, let there be no obstacle during our period of study. Let Your protection always be with us. Grant the prosperity needed for both of us to eat and drink."</w:t>
+        <w:t>'saha nau bhunaktu': 'Bhunaktu' means to nourish or to feed. "O Lord, let there be no obstacle during our period of study. Let Your protection always be with us. Grant the prosperity needed for both of us to eat and drink."</w:t>
       </w:r>
     </w:p>
     <w:p>
@@ -791,7 +791,7 @@
         <w:jc w:val="left"/>
       </w:pPr>
       <w:r>
-        <w:t>'Saha viryam karavavahai': "Grant the Acharya the ability to give us this spiritual knowledge and uplift us. Let our study remain effective. Grant us the ability to comprehend this knowledge and to use it practically in life for the benefit of the world."</w:t>
+        <w:t>'saha vīryaṃ karavāvahai': "Grant the Acharya the ability to give us this spiritual knowledge and uplift us. Let our study remain effective. Grant us the ability to comprehend this knowledge and to use it practically in life for the benefit of the world."</w:t>
       </w:r>
     </w:p>
     <w:p>
@@ -800,7 +800,7 @@
         <w:jc w:val="left"/>
       </w:pPr>
       <w:r>
-        <w:t>'Tejasvi navadhitamastu ma vidvishavahai': "Let the brilliance of our joint study manifest in us through the teacher-student tradition. Let the vitality needed to continue the knowledge uplifted through the disciple lineage come to us. Grant me the power to give what the teacher has taught to my next generation. Until our lives end, let neither of us hate the other; may we live with mutual respect and love. May we never hate anyone, may we live loving everyone."</w:t>
+        <w:t>'tejasvi nāvadhītamastu mā vidviṣāvahai': "Let the brilliance of our joint study manifest in us through the teacher-student tradition. Let the vitality needed to continue the knowledge uplifted through the disciple lineage come to us. Grant me the power to give what the teacher has taught to my next generation. Until our lives end, let neither of us hate the other; may we live with mutual respect and love. May we never hate anyone, may we live loving everyone."</w:t>
       </w:r>
     </w:p>
     <w:p>
@@ -809,7 +809,7 @@
         <w:jc w:val="left"/>
       </w:pPr>
       <w:r>
-        <w:t>Om Shantih Shantih Shantih: 'Om' is the most fundamental sacred syllable. It is the Lord's name. 'Sham' means bliss; 'i' means knowledge; 'anta' means the ultimate end. Therefore 'Om Shantih' means: 'The Lord who abides at the ultimate end of knowledge-bliss.' The Lord who is present in all three Vedas, who exists in all three times, who is everywhere — the Lord is full of knowledge-bliss, and thus this is said three times here. "Through this contemplation, grant us peace in our life as well" — this is the prayer embedded here.</w:t>
+        <w:t>Om Śāntiḥ Śāntiḥ Śāntiḥ: 'oṃ' is the most fundamental sacred syllable. It is the Lord's name. 'śam' means bliss; 'i' means knowledge; 'anta' means the ultimate end. Therefore 'oṃ śāntiḥ' means: 'The Lord who abides at the ultimate end of knowledge-bliss.' The Lord who is present in all three Vedas, who exists in all three times, who is everywhere — the Lord is full of knowledge-bliss, and thus this is said three times here. "Through this contemplation, grant us peace in our life as well" — this is the prayer embedded here.</w:t>
       </w:r>
     </w:p>
     <w:p>
@@ -845,7 +845,7 @@
           <w:i/>
           <w:sz w:val="22"/>
         </w:rPr>
-        <w:t>[Thus ends the Shanti Patha.]</w:t>
+        <w:t>[Thus ends the Śānti Patha.]</w:t>
       </w:r>
     </w:p>
     <w:p>
@@ -859,7 +859,7 @@
           <w:i/>
           <w:sz w:val="19"/>
         </w:rPr>
-        <w:t>Source: Bannanje Govindacharya's Upanishad Discourses                                           Page 6</w:t>
+        <w:t>Source: Bannanje Govindacharya's Upaniṣad Discourses                                           Page 6</w:t>
       </w:r>
     </w:p>
     <w:p>
@@ -896,7 +896,7 @@
         <w:jc w:val="left"/>
       </w:pPr>
       <w:r>
-        <w:t>Valli 1</w:t>
+        <w:t>Vallī 1</w:t>
       </w:r>
     </w:p>
     <w:p>
@@ -978,7 +978,7 @@
           <w:i/>
           <w:sz w:val="22"/>
         </w:rPr>
-        <w:t>[Om. Vajashravasa, desiring to obtain a reward, performed the Vishvajit sacrifice, giving away all his wealth. He had a son named Nachiketa. ||1||]</w:t>
+        <w:t>[Om. Vājaśravasa, desiring to obtain a reward, performed the Vishvajit sacrifice, giving away all his wealth. He had a son named Naciketā. ||1||]</w:t>
       </w:r>
     </w:p>
     <w:p>
@@ -987,7 +987,7 @@
         <w:jc w:val="left"/>
       </w:pPr>
       <w:r>
-        <w:t>Vajashravasa's daughter was Aruna. Aruna's son Uddhalaka — (he is also called Auddalaki Aruni). He had two sons: Shvetaketu and Nachiketa. [In this shloka, translators commonly mistranslate 'Vajashravasah' as 'Nachiketa, the son of Vajashravasa'. But that is incorrect.] Uddhalaka, born and raised in the family of Vajashravasa renowned for philosophical inquiry, liberal giving, and feeding — was performing the Vishvajit yajna desiring to attain heaven. A yajna performed with results dedicated to the Lord — this is the deeper meaning of the karma mentioned in the Bhagavad Gita. The karma performed as dedication to the Lord — its fruits do not diminish, and the Lord's grace is obtained — this is the message of the Bhagavad Gita. But Uddhalaka's mind was not set on selfless karma. His mind was on the greed in giving away all wealth in the yajna.</w:t>
+        <w:t>Vājaśravasa's daughter was Aruṇā. Aruṇā's son Uddālaka — (he is also called Auddālaki Āruṇi). He had two sons: Śvetaketu and Naciketā. [In this śloka, translators commonly mistranslate 'Vājaśravasaḥ' as 'Naciketā, the son of Vājaśravasa'. But that is incorrect.] Uddālaka, born and raised in the family of Vājaśravasa renowned for philosophical inquiry, liberal giving, and feeding — was performing the Vishvajit yajña desiring to attain heaven. A yajña performed with results dedicated to the Lord — this is the deeper meaning of the karma mentioned in the Bhagavad Gītā. The karma performed as dedication to the Lord — its fruits do not diminish, and the Lord's grace is obtained — this is the message of the Bhagavad Gītā. But Uddālaka's mind was not set on selfless karma. His mind was on the greed in giving away all wealth in the yajña.</w:t>
       </w:r>
     </w:p>
     <w:p>
@@ -1112,7 +1112,7 @@
         <w:jc w:val="left"/>
       </w:pPr>
       <w:r>
-        <w:t>[As the dakshinas were being led away, faith entered the boy; he thought: ||2||</w:t>
+        <w:t>[As the dakṣiṇās were being led away, faith entered the boy; he thought: ||2||</w:t>
       </w:r>
     </w:p>
     <w:p>
@@ -1130,7 +1130,7 @@
         <w:jc w:val="left"/>
       </w:pPr>
       <w:r>
-        <w:t>The wealth of sages who lived in the forest was primarily cows. Uddhalaka, driven by greed, was giving away emaciated cows as dakshina. Seeing this, Nachiketa, who was a perceptive boy even as a child, felt it was not appropriate for his father to act this way.</w:t>
+        <w:t>The wealth of sages who lived in the forest was primarily cows. Uddālaka, driven by greed, was giving away emaciated cows as dakṣiṇā. Seeing this, Naciketā, who was a perceptive boy even as a child, felt it was not appropriate for his father to act this way.</w:t>
       </w:r>
     </w:p>
     <w:p>
@@ -1144,7 +1144,7 @@
           <w:i/>
           <w:sz w:val="19"/>
         </w:rPr>
-        <w:t>Source: Bannanje Govindacharya's Upanishad Discourses                                           Page 7</w:t>
+        <w:t>Source: Bannanje Govindacharya's Upaniṣad Discourses                                           Page 7</w:t>
       </w:r>
     </w:p>
     <w:p>
@@ -1172,7 +1172,7 @@
         <w:jc w:val="left"/>
       </w:pPr>
       <w:r>
-        <w:t>The wealth of sages who ordinarily lived in the forest was primarily cows. Driven by greed, Uddhalaka was giving away emaciated cows. Seeing this, Nachiketa thought the father's action was wrong. Though the father was performing a great religious act called a yajna, sinful conduct was occurring through greed.</w:t>
+        <w:t>The wealth of sages who ordinarily lived in the forest was primarily cows. Driven by greed, Uddālaka was giving away emaciated cows. Seeing this, Naciketā thought the father's action was wrong. Though the father was performing a great religious act called a yajña, sinful conduct was occurring through greed.</w:t>
       </w:r>
     </w:p>
     <w:p>
@@ -1181,7 +1181,7 @@
         <w:jc w:val="left"/>
       </w:pPr>
       <w:r>
-        <w:t>The next day Nachiketa approached his father's presence with clear reasoning: "Father, you are giving me away in this yajna as well — to whom will you give me?" The father, intent on the yajna, paid no attention to his son's words. But Nachiketa, thinking even the fruit of a yajna performed this way would certainly go to bad results, pressed again a second time: "Father, to whom will you give me?" Even when the father did not listen to this, Nachiketa asked a third time: "Father — to whom are you giving me?" When the son asked thus three times, Uddhalaka became angry and said in anger: "Mrityave tva dadami" — meaning "I give you to Death (Yama)." It is not possible to go to the subtle world with the gross body. Only as a subtle body after renouncing the gross body can one travel to the subtle realm. Inside each of our bodies there is a subtle body. This is called the aniroda body. Psychologists call this the 'Astral Body'. Since it is not possible to see the subtle world with the gross body, Uddhalaka's words here — "go and die" — were actually a curse!</w:t>
+        <w:t>The next day Naciketā approached his father's presence with clear reasoning: "Father, you are giving me away in this yajña as well — to whom will you give me?" The father, intent on the yajña, paid no attention to his son's words. But Naciketā, thinking even the fruit of a yajña performed this way would certainly go to bad results, pressed again a second time: "Father, to whom will you give me?" Even when the father did not listen to this, Naciketā asked a third time: "Father — to whom are you giving me?" When the son asked thus three times, Uddālaka became angry and said in anger: "Mrityave tva dadami" — meaning "I give you to Death (Yama)." It is not possible to go to the subtle world with the gross body. Only as a subtle body after renouncing the gross body can one travel to the subtle realm. Inside each of our bodies there is a subtle body. This is called the aniroda body. Psychologists call this the 'Astral Body'. Since it is not possible to see the subtle world with the gross body, Uddālaka's words here — "go and die" — were actually a curse!</w:t>
       </w:r>
     </w:p>
     <w:p>
@@ -1190,7 +1190,7 @@
         <w:jc w:val="left"/>
       </w:pPr>
       <w:r>
-        <w:t>When the command to "die" came from the father's mouth, Nachiketa gave up his gross body to fulfil his father's command and departed. [A recent incident in our country of hypnotism (mesmerism) is relevant here. During a demonstration, at one stage the person being hypnotised (person under hypnosis) would not immediately follow the words of the hypnotist. The angry hypnotist then cursed "Go to Hell." Immediately the hypnotised person fell there and went into convulsions.]</w:t>
+        <w:t>When the command to "die" came from the father's mouth, Naciketā gave up his gross body to fulfil his father's command and departed. [A recent incident in our country of hypnotism (mesmerism) is relevant here. During a demonstration, at one stage the person being hypnotised (person under hypnosis) would not immediately follow the words of the hypnotist. The angry hypnotist then cursed "Go to Hell." Immediately the hypnotised person fell there and went into convulsions.]</w:t>
       </w:r>
     </w:p>
     <w:p>
@@ -1199,7 +1199,7 @@
         <w:jc w:val="left"/>
       </w:pPr>
       <w:r>
-        <w:t>Before proceeding to the next shloka, let us look a little more closely at Nachiketa's story. Nachiketa's story appears not only in the Kathakopanishad but also in the Taittiriya Brahmana [3-1-8], the Mahabharata [Anushasana Parva] and in the Puranas. As we look at each account, we find some new things, and some variations. Only when we synthesise all of them can we fully and completely understand the story. The ancients never presented any subject through just one angle. They had very valuable ideas and intended them to be received only by the worthy — thus they hid one subject across many texts. So when we look at only one philosophical text, we cannot fully understand the depth of that work. Only with more study, when God's grace is present, does the truth become clear.</w:t>
+        <w:t>Before proceeding to the next śloka, let us look a little more closely at Naciketā's story. Naciketā's story appears not only in the Kāṭhakopaniṣad but also in the Taittirīya Brāhmaṇa [3-1-8], the Mahābhārata [Anushasana Parva] and in the Purāṇas. As we look at each account, we find some new things, and some variations. Only when we synthesise all of them can we fully and completely understand the story. The ancients never presented any subject through just one angle. They had very valuable ideas and intended them to be received only by the worthy — thus they hid one subject across many texts. So when we look at only one philosophical text, we cannot fully understand the depth of that work. Only with more study, when God's grace is present, does the truth become clear.</w:t>
       </w:r>
     </w:p>
     <w:p>
@@ -1208,7 +1208,7 @@
         <w:jc w:val="left"/>
       </w:pPr>
       <w:r>
-        <w:t>The story continues — Nachiketa departed for Yamaloka after death and waited there three days without food as a guest. When Yama arrived after being away, he said to Nachiketa: "Ask three boons." But in the Taittiriya Brahmana the same story is slightly different. As Nachiketa journeyed to the death realm after death, Mahavishnu's presence appeared along the way. "You will not see Yama for three days; when Yama returns, he will tell you to ask three boons, and you should ask: that the body given up may be reborn, that the knowledge of Agni-vidya (Agni-brahma) may become a means to the Supreme — and ask for the knowledge of what lies beyond death" — thus the deity sent him with instructions. This same story is somewhat different in the Mahabharata. One day Uddhalaka went to the riverbank with his son for a bath. Returning home, he forgot his water-vessel (pot). Noticing this when he came home, he called his son Nachiketa and sent him to the river to bring the forgotten vessel. But Nachiketa returned without the vessel.</w:t>
+        <w:t>The story continues — Naciketā departed for Yamaloka after death and waited there three days without food as a guest. When Yama arrived after being away, he said to Naciketā: "Ask three boons." But in the Taittirīya Brāhmaṇa the same story is slightly different. As Naciketā journeyed to the death realm after death, Mahavishnu's presence appeared along the way. "You will not see Yama for three days; when Yama returns, he will tell you to ask three boons, and you should ask: that the body given up may be reborn, that the knowledge of Agni-vidyā (Agni-brahma) may become a means to the Supreme — and ask for the knowledge of what lies beyond death" — thus the deity sent him with instructions. This same story is somewhat different in the Mahābhārata. One day Uddālaka went to the riverbank with his son for a bath. Returning home, he forgot his water-vessel (pot). Noticing this when he came home, he called his son Naciketā and sent him to the river to bring the forgotten vessel. But Naciketā returned without the vessel.</w:t>
       </w:r>
     </w:p>
     <w:p>
@@ -1222,7 +1222,7 @@
           <w:i/>
           <w:sz w:val="19"/>
         </w:rPr>
-        <w:t>Source: Bannanje Govindacharya's Upanishad Discourses                                           Page 8</w:t>
+        <w:t>Source: Bannanje Govindacharya's Upaniṣad Discourses                                           Page 8</w:t>
       </w:r>
     </w:p>
     <w:p>
@@ -1250,7 +1250,7 @@
         <w:jc w:val="left"/>
       </w:pPr>
       <w:r>
-        <w:t>Seeing that Nachiketa returned without the water-vessel, Uddhalaka asked: "Why didn't you bring the vessel?" Nachiketa replied: "I went, but a thief was stealing things there. If I had taken the vessel, people would have suspected me. So I returned without it." The father praised Nachiketa for his honest and discerning mind. In this story a variation appears: Nachiketa is Shvetaketu's brother. The name 'Shvetaketu' is a common name — the story says that Nachiketa was the younger brother.</w:t>
+        <w:t>Seeing that Naciketā returned without the water-vessel, Uddālaka asked: "Why didn't you bring the vessel?" Naciketā replied: "I went, but a thief was stealing things there. If I had taken the vessel, people would have suspected me. So I returned without it." The father praised Naciketā for his honest and discerning mind. In this story a variation appears: Naciketā is Śvetaketu's brother. The name 'Śvetaketu' is a common name — the story says that Naciketā was the younger brother.</w:t>
       </w:r>
     </w:p>
     <w:p>
@@ -1259,7 +1259,7 @@
         <w:jc w:val="left"/>
       </w:pPr>
       <w:r>
-        <w:t>If the father gave such a positive assessment of Nachiketa's thinking ability, how then in the Kathopanishad did the father come to say "I give you to Death"? What is the actual story?</w:t>
+        <w:t>If the father gave such a positive assessment of Naciketā's thinking ability, how then in the Kaṭhopaniṣad did the father come to say "I give you to Death"? What is the actual story?</w:t>
       </w:r>
     </w:p>
     <w:p>
@@ -1268,7 +1268,7 @@
         <w:jc w:val="left"/>
       </w:pPr>
       <w:r>
-        <w:t>Looking at all versions together: Nachiketa's father Uddhalaka was a great scholar. But he had not fully given up the attachment to worldly things. Being a learned person, he knew what was right and what was wrong. But he had not yet fully internalized it. In such a state, when performing the Vishvajit yajna, and when young Nachiketa asked "To whom are you giving me?" — the father might have felt embarrassed in front of the assembled sages. In that state of embarrassment and shame, the words "I give you to Death" may have escaped his lips. This is also a possible reading.</w:t>
+        <w:t>Looking at all versions together: Naciketā's father Uddālaka was a great scholar. But he had not fully given up the attachment to worldly things. Being a learned person, he knew what was right and what was wrong. But he had not yet fully internalized it. In such a state, when performing the Vishvajit yajña, and when young Naciketā asked "To whom are you giving me?" — the father might have felt embarrassed in front of the assembled sages. In that state of embarrassment and shame, the words "I give you to Death" may have escaped his lips. This is also a possible reading.</w:t>
       </w:r>
     </w:p>
     <w:p>
@@ -1277,7 +1277,7 @@
         <w:jc w:val="left"/>
       </w:pPr>
       <w:r>
-        <w:t>Another possibility: Nachiketa's questions were persistent. A child asking the same question three times even after the parent has clearly not responded — what does that show? That the child is very wise. In a state of agitation and anger, the father said those words. From the spiritual standpoint, both interpretations lead to the same result: Nachiketa went to Yamaloka.</w:t>
+        <w:t>Another possibility: Naciketā's questions were persistent. A child asking the same question three times even after the parent has clearly not responded — what does that show? That the child is very wise. In a state of agitation and anger, the father said those words. From the spiritual standpoint, both interpretations lead to the same result: Naciketā went to Yamaloka.</w:t>
       </w:r>
     </w:p>
     <w:p>
@@ -1286,7 +1286,7 @@
         <w:jc w:val="left"/>
       </w:pPr>
       <w:r>
-        <w:t>When Nachiketa reached Yamaloka, Yama was absent. Nachiketa waited three days and three nights. When Yama returned, seeing this young boy who had waited without food or water for three full days, Yama was moved. He said: "O Brahmin boy, you have waited here for three days without food — I am sorry. Please ask three boons, one for each day."</w:t>
+        <w:t>When Naciketā reached Yamaloka, Yama was absent. Naciketā waited three days and three nights. When Yama returned, seeing this young boy who had waited without food or water for three full days, Yama was moved. He said: "O Brahmin boy, you have waited here for three days without food — I am sorry. Please ask three boons, one for each day."</w:t>
       </w:r>
     </w:p>
     <w:p>
@@ -1300,7 +1300,7 @@
           <w:i/>
           <w:sz w:val="19"/>
         </w:rPr>
-        <w:t>Source: Bannanje Govindacharya's Upanishad Discourses                                           Page 9</w:t>
+        <w:t>Source: Bannanje Govindacharya's Upaniṣad Discourses                                           Page 9</w:t>
       </w:r>
     </w:p>
     <w:p>
@@ -1459,7 +1459,7 @@
         <w:jc w:val="left"/>
       </w:pPr>
       <w:r>
-        <w:t>Yama addresses Nachiketa as 'Brahmin'. In the Vedic tradition, one who knows Brahman is a Brahmin — not merely by birth. Nachiketa, though a boy, was a genuine seeker of Brahman. Hence Yama addresses him with great respect as 'Brahmin'.</w:t>
+        <w:t>Yama addresses Naciketā as 'Brahmin'. In the Vedic tradition, one who knows Brahman is a Brahmin — not merely by birth. Naciketā, though a boy, was a genuine seeker of Brahman. Hence Yama addresses him with great respect as 'Brahmin'.</w:t>
       </w:r>
     </w:p>
     <w:p>
@@ -1468,7 +1468,7 @@
         <w:jc w:val="left"/>
       </w:pPr>
       <w:r>
-        <w:t>"You stayed in my house for three nights without eating" — Yama acknowledges his fault. He admits that by remaining absent when a guest was at the door, he had failed in his duty as host. The sacred duty of receiving guests (atithi seva) was one of the highest dharmas. Yama, even as the Lord of Death, acknowledges that he failed in this duty and asks for forgiveness.</w:t>
+        <w:t>"You stayed in my house for three nights without eating" — Yama acknowledges his fault. He admits that by remaining absent when a guest was at the door, he had failed in his duty as host. The sacred duty of receiving guests (atithi sevā) was one of the highest dharmas. Yama, even as the Lord of Death, acknowledges that he failed in this duty and asks for forgiveness.</w:t>
       </w:r>
     </w:p>
     <w:p>
@@ -1477,7 +1477,7 @@
         <w:jc w:val="left"/>
       </w:pPr>
       <w:r>
-        <w:t>"Therefore choose three boons" — Nachiketa's three boons become the structure of the entire Upanishad: the first boon concerns the welfare of his father; the second concerns the knowledge of the sacred fire (Agni-vidya) that leads to heaven; and the third — the most crucial — concerns the knowledge of what happens after death. It is this third boon that contains the entire philosophical teaching of the Upanishad.</w:t>
+        <w:t>"Therefore choose three boons" — Naciketā's three boons become the structure of the entire Upaniṣad: the first boon concerns the welfare of his father; the second concerns the knowledge of the sacred fire (Agni-vidyā) that leads to heaven; and the third — the most crucial — concerns the knowledge of what happens after death. It is this third boon that contains the entire philosophical teaching of the Upaniṣad.</w:t>
       </w:r>
     </w:p>
     <w:p>
@@ -1637,7 +1637,7 @@
           <w:i/>
           <w:sz w:val="22"/>
         </w:rPr>
-        <w:t>[Nachiketa said: "O Death, may Gautama (my father) be of calmed mind and good disposition, free from anger. May he recognise me when sent back by you and welcome me. This I choose as the first of the three boons." ||10||]</w:t>
+        <w:t>[Naciketā said: "O Death, may Gautama (my father) be of calmed mind and good disposition, free from anger. May he recognise me when sent back by you and welcome me. This I choose as the first of the three boons." ||10||]</w:t>
       </w:r>
     </w:p>
     <w:p>
@@ -1646,7 +1646,7 @@
         <w:jc w:val="left"/>
       </w:pPr>
       <w:r>
-        <w:t>The first boon: May my father be free from grief and worry on my account, and may he welcome me back gladly when I return. This shows Nachiketa's remarkable character — even after his father sent him to Death, his first thought is his father's wellbeing.</w:t>
+        <w:t>The first boon: May my father be free from grief and worry on my account, and may he welcome me back gladly when I return. This shows Naciketā's remarkable character — even after his father sent him to Death, his first thought is his father's wellbeing.</w:t>
       </w:r>
     </w:p>
     <w:p>
@@ -1660,7 +1660,7 @@
           <w:i/>
           <w:sz w:val="19"/>
         </w:rPr>
-        <w:t>Source: Bannanje Govindacharya's Upanishad Discourses                                           Page 10</w:t>
+        <w:t>Source: Bannanje Govindacharya's Upaniṣad Discourses                                           Page 10</w:t>
       </w:r>
     </w:p>
     <w:p>
@@ -1688,7 +1688,7 @@
         <w:jc w:val="left"/>
       </w:pPr>
       <w:r>
-        <w:t>Nachiketa, journeying to Yamaloka, heard the words of Yama's messengers along the way. Suddenly it appeared that Nachiketa was beginning to understand many things. What are the secrets of this world? What is beyond this world? Where does man go after death? These are questions that arise naturally in every thinking mind. Even young Nachiketa was no exception.</w:t>
+        <w:t>Naciketā, journeying to Yamaloka, heard the words of Yama's messengers along the way. Suddenly it appeared that Naciketā was beginning to understand many things. What are the secrets of this world? What is beyond this world? Where does man go after death? These are questions that arise naturally in every thinking mind. Even young Naciketā was no exception.</w:t>
       </w:r>
     </w:p>
     <w:p>
@@ -1790,7 +1790,7 @@
           <w:i/>
           <w:sz w:val="22"/>
         </w:rPr>
-        <w:t>[Yama said: "As you have said, Nachiketa — so be it. Your father Gautama and your mother will be pleased. He will live long, fully awakened through the nights." ||11||]</w:t>
+        <w:t>[Yama said: "As you have said, Naciketā — so be it. Your father Gautama and your mother will be pleased. He will live long, fully awakened through the nights." ||11||]</w:t>
       </w:r>
     </w:p>
     <w:p>
@@ -2070,7 +2070,7 @@
           <w:i/>
           <w:sz w:val="22"/>
         </w:rPr>
-        <w:t>["You, O Nachiketa, know the fire that leads to heaven — please teach me who has faith. Those in the heavenly world attain immortality. This I choose as the second boon." ||13||]</w:t>
+        <w:t>["You, O Naciketā, know the fire that leads to heaven — please teach me who has faith. Those in the heavenly world attain immortality. This I choose as the second boon." ||13||]</w:t>
       </w:r>
     </w:p>
     <w:p>
@@ -2084,7 +2084,7 @@
           <w:i/>
           <w:sz w:val="19"/>
         </w:rPr>
-        <w:t>Source: Bannanje Govindacharya's Upanishad Discourses                                           Page 11</w:t>
+        <w:t>Source: Bannanje Govindacharya's Upaniṣad Discourses                                           Page 11</w:t>
       </w:r>
     </w:p>
     <w:p>
@@ -2112,7 +2112,7 @@
         <w:jc w:val="left"/>
       </w:pPr>
       <w:r>
-        <w:t>Yama was pleased with this question too. He then taught Nachiketa in detail the knowledge of the sacred fire (Nachiketa Agni / Agni-vidya). This knowledge involves understanding how the Lord pervades all creation through fire — the fire in the sacrificial altar, the fire that is prana (life-breath) within the body, and the fire that is the sun in the cosmos. These three fires represent the three forms of the Lord: Agni (fire), Vayu (wind), and Aditya (sun).</w:t>
+        <w:t>Yama was pleased with this question too. He then taught Naciketā in detail the knowledge of the sacred fire (Naciketā Agni / Agni-vidyā). This knowledge involves understanding how the Lord pervades all creation through fire — the fire in the sacrificial altar, the fire that is prāṇa (life-breath) within the body, and the fire that is the sun in the cosmos. These three fires represent the three forms of the Lord: Agni (fire), Vāyu (wind), and Aditya (sun).</w:t>
       </w:r>
     </w:p>
     <w:p>
@@ -2243,7 +2243,7 @@
           <w:i/>
           <w:sz w:val="22"/>
         </w:rPr>
-        <w:t>[Yama taught Nachiketa the fire. Then: "As many worlds as are in this yajna — the triple Nachiketa fire — by performing the three actions, one crosses birth and death."]</w:t>
+        <w:t>[Yama taught Naciketā the fire. Then: "As many worlds as are in this yajña — the triple Naciketā fire — by performing the three actions, one crosses birth and death."]</w:t>
       </w:r>
     </w:p>
     <w:p>
@@ -2252,7 +2252,7 @@
         <w:jc w:val="left"/>
       </w:pPr>
       <w:r>
-        <w:t>The knowledge of fire that Yama taught Nachiketa is fundamentally a meditation on the Lord who pervades all three levels of existence: the cosmic, the social, and the bodily. Understanding that the same Lord pervades all three fires is the key to liberation.</w:t>
+        <w:t>The knowledge of fire that Yama taught Naciketā is fundamentally a meditation on the Lord who pervades all three levels of existence: the cosmic, the social, and the bodily. Understanding that the same Lord pervades all three fires is the key to liberation.</w:t>
       </w:r>
     </w:p>
     <w:p>
@@ -2261,7 +2261,7 @@
         <w:jc w:val="left"/>
       </w:pPr>
       <w:r>
-        <w:t>After teaching Nachiketa the Agni-vidya, Yama was so pleased that he named the sacred fire after Nachiketa — 'Nachiketa Agni'. This was a remarkable honour. "From now on this triple fire shall be called by your name, O Nachiketa," said Yama.</w:t>
+        <w:t>After teaching Naciketā the Agni-vidyā, Yama was so pleased that he named the sacred fire after Naciketā — 'Naciketā Agni'. This was a remarkable honour. "From now on this triple fire shall be called by your name, O Naciketā," said Yama.</w:t>
       </w:r>
     </w:p>
     <w:p>
@@ -2392,7 +2392,7 @@
           <w:i/>
           <w:sz w:val="22"/>
         </w:rPr>
-        <w:t>["One who knows these three [fires], and knowing thus builds the Nachiketa fire — that person, having cast off the bonds of death beforehand, transcends sorrow and rejoices in the heavenly world." ||17||]</w:t>
+        <w:t>["One who knows these three [fires], and knowing thus builds the Naciketā fire — that person, having cast off the bonds of death beforehand, transcends sorrow and rejoices in the heavenly world." ||17||]</w:t>
       </w:r>
     </w:p>
     <w:p>
@@ -2406,7 +2406,7 @@
           <w:i/>
           <w:sz w:val="19"/>
         </w:rPr>
-        <w:t>Source: Bannanje Govindacharya's Upanishad Discourses                                           Page 12</w:t>
+        <w:t>Source: Bannanje Govindacharya's Upaniṣad Discourses                                           Page 12</w:t>
       </w:r>
     </w:p>
     <w:p>
@@ -2556,7 +2556,7 @@
           <w:i/>
           <w:sz w:val="22"/>
         </w:rPr>
-        <w:t>["This, O Nachiketa, is the heavenly fire that you chose as the second boon. People will call this fire by your name alone. Now choose the third boon, Nachiketa." ||18||]</w:t>
+        <w:t>["This, O Naciketā, is the heavenly fire that you chose as the second boon. People will call this fire by your name alone. Now choose the third boon, Naciketā." ||18||]</w:t>
       </w:r>
     </w:p>
     <w:p>
@@ -2565,7 +2565,7 @@
         <w:jc w:val="left"/>
       </w:pPr>
       <w:r>
-        <w:t>Nachiketa's third boon — the most crucial question:</w:t>
+        <w:t>Naciketā's third boon — the most crucial question:</w:t>
       </w:r>
     </w:p>
     <w:p>
@@ -2705,7 +2705,7 @@
         <w:jc w:val="left"/>
       </w:pPr>
       <w:r>
-        <w:t>This is the question at the heart of the entire Upanishad. What happens to a person after death? Does the soul continue? This is the question that humans have pondered through all ages. Nachiketa, standing before Death himself, asks the question with complete sincerity.</w:t>
+        <w:t>This is the question at the heart of the entire Upaniṣad. What happens to a person after death? Does the soul continue? This is the question that humans have pondered through all ages. Naciketā, standing before Death himself, asks the question with complete sincerity.</w:t>
       </w:r>
     </w:p>
     <w:p>
@@ -2714,7 +2714,7 @@
         <w:jc w:val="left"/>
       </w:pPr>
       <w:r>
-        <w:t>Now Yama tries to divert Nachiketa from this question with temptations:</w:t>
+        <w:t>Now Yama tries to divert Naciketā from this question with temptations:</w:t>
       </w:r>
     </w:p>
     <w:p>
@@ -2903,7 +2903,7 @@
           <w:i/>
           <w:sz w:val="22"/>
         </w:rPr>
-        <w:t>["Choose other boons, Nachiketa — this boon I shall not grant. Choose sons and grandsons who will live a hundred years; choose many cattle, elephants, gold, horses; choose great expanses of land. Live yourself a hundred autumns." ||23-24||]</w:t>
+        <w:t>["Choose other boons, Naciketā — this boon I shall not grant. Choose sons and grandsons who will live a hundred years; choose many cattle, elephants, gold, horses; choose great expanses of land. Live yourself a hundred autumns." ||23-24||]</w:t>
       </w:r>
     </w:p>
     <w:p>
@@ -2917,7 +2917,7 @@
           <w:i/>
           <w:sz w:val="19"/>
         </w:rPr>
-        <w:t>Source: Bannanje Govindacharya's Upanishad Discourses                                           Page 13</w:t>
+        <w:t>Source: Bannanje Govindacharya's Upaniṣad Discourses                                           Page 13</w:t>
       </w:r>
     </w:p>
     <w:p>
@@ -3018,7 +3018,7 @@
         <w:jc w:val="left"/>
       </w:pPr>
       <w:r>
-        <w:t>Yama continued offering temptations: "O Nachiketa — whatever boons that are hard to obtain in the mortal world — choose all of them. Here are beautiful women with chariots and musical instruments — the kind even the gods cannot easily obtain. Accept these as my gift. But do not ask me about death."</w:t>
+        <w:t>Yama continued offering temptations: "O Naciketā — whatever boons that are hard to obtain in the mortal world — choose all of them. Here are beautiful women with chariots and musical instruments — the kind even the gods cannot easily obtain. Accept these as my gift. But do not ask me about death."</w:t>
       </w:r>
     </w:p>
     <w:p>
@@ -3027,7 +3027,7 @@
         <w:jc w:val="left"/>
       </w:pPr>
       <w:r>
-        <w:t>But Nachiketa, with complete detachment, declined all these offers:</w:t>
+        <w:t>But Naciketā, with complete detachment, declined all these offers:</w:t>
       </w:r>
     </w:p>
     <w:p>
@@ -3307,7 +3307,7 @@
         <w:jc w:val="left"/>
       </w:pPr>
       <w:r>
-        <w:t>Nachiketa's response reveals his extraordinary wisdom. He understood that no amount of worldly pleasure could satisfy — only the knowledge of the Self could.</w:t>
+        <w:t>Naciketā's response reveals his extraordinary wisdom. He understood that no amount of worldly pleasure could satisfy — only the knowledge of the Self could.</w:t>
       </w:r>
     </w:p>
     <w:p>
@@ -3438,7 +3438,7 @@
           <w:i/>
           <w:sz w:val="22"/>
         </w:rPr>
-        <w:t>["That which is doubted about this great hereafter — O Death, tell us that. Nachiketa will choose no other boon than this one, which has entered deeply into the mystery." ||29||]</w:t>
+        <w:t>["That which is doubted about this great hereafter — O Death, tell us that. Naciketā will choose no other boon than this one, which has entered deeply into the mystery." ||29||]</w:t>
       </w:r>
     </w:p>
     <w:p>
@@ -3473,7 +3473,7 @@
           <w:i/>
           <w:sz w:val="19"/>
         </w:rPr>
-        <w:t>Source: Bannanje Govindacharya's Upanishad Discourses                                           Page 14</w:t>
+        <w:t>Source: Bannanje Govindacharya's Upaniṣad Discourses                                           Page 14</w:t>
       </w:r>
     </w:p>
     <w:p>
@@ -3501,7 +3501,7 @@
         <w:jc w:val="left"/>
       </w:pPr>
       <w:r>
-        <w:t>Valli 2</w:t>
+        <w:t>Vallī 2</w:t>
       </w:r>
     </w:p>
     <w:p>
@@ -3510,7 +3510,7 @@
         <w:jc w:val="left"/>
       </w:pPr>
       <w:r>
-        <w:t>Seeing Nachiketa's firm spiritual resolve and the determination to know, Yama was very pleased. Seeing a student who so dispassionately wants 'knowledge for the sake of knowledge alone, nothing else', Yama speaks a beautiful statement:</w:t>
+        <w:t>Seeing Naciketā's firm spiritual resolve and the determination to know, Yama was very pleased. Seeing a student who so dispassionately wants 'knowledge for the sake of knowledge alone, nothing else', Yama speaks a beautiful statement:</w:t>
       </w:r>
     </w:p>
     <w:p>
@@ -3583,7 +3583,7 @@
           <w:i/>
           <w:sz w:val="22"/>
         </w:rPr>
-        <w:t>[The good (shreyas) is one thing; the pleasant (preyas) is another. Both bind the person to different purposes. Of these, it is good for the one who takes the shreyas; one who chooses the preyas falls short of the goal. ||1||]</w:t>
+        <w:t>[The good (śreyas) is one thing; the pleasant (preyas) is another. Both bind the person to different purposes. Of these, it is good for the one who takes the śreyas; one who chooses the preyas falls short of the goal. ||1||]</w:t>
       </w:r>
     </w:p>
     <w:p>
@@ -3592,7 +3592,7 @@
         <w:jc w:val="left"/>
       </w:pPr>
       <w:r>
-        <w:t>Yama says: There are two main things that trouble a person. One is shreyas (the beneficial) and the other is preyas (the pleasant). What does good for us and what is beneficial is shreyas. What is dear to us but perishable is preyas. For example, for a diabetic patient, bitter medicine is shreyas, but sweets are preyas. These shreyas and preyas bind a person. A person lives in the dilemma of which to choose. Those who choose the path of shreyas obtain blissful, liberation-culminating results. One who falls for craving and treads the path of preyas instead of shreyas loses the meaning of his life and wastes his entire existence.</w:t>
+        <w:t>Yama says: There are two main things that trouble a person. One is śreyas (the beneficial) and the other is preyas (the pleasant). What does good for us and what is beneficial is śreyas. What is dear to us but perishable is preyas. For example, for a diabetic patient, bitter medicine is śreyas, but sweets are preyas. These śreyas and preyas bind a person. A person lives in the dilemma of which to choose. Those who choose the path of śreyas obtain blissful, liberation-culminating results. One who falls for craving and treads the path of preyas instead of śreyas loses the meaning of his life and wastes his entire existence.</w:t>
       </w:r>
     </w:p>
     <w:p>
@@ -3665,7 +3665,7 @@
           <w:i/>
           <w:sz w:val="22"/>
         </w:rPr>
-        <w:t>[Both shreyas and preyas present themselves to a person; the wise examines both and discriminates. The wise one chooses shreyas over preyas; the foolish one, driven by gain and security, chooses preyas. ||2||]</w:t>
+        <w:t>[Both śreyas and preyas present themselves to a person; the wise examines both and discriminates. The wise one chooses śreyas over preyas; the foolish one, driven by gain and security, chooses preyas. ||2||]</w:t>
       </w:r>
     </w:p>
     <w:p>
@@ -3674,7 +3674,7 @@
         <w:jc w:val="left"/>
       </w:pPr>
       <w:r>
-        <w:t>Generally these shreyas and preyas sit in a person's mind and trouble them. Then the wise person, after analysing well what is needed and what is not, takes a decision with discernment. This person is courageous — he has the wisdom: 'I want what is beneficial, not what is merely pleasant; I must not fall into this attraction.' This is very difficult. Generally a person knows what is bad. But even knowing this, more people fall prey to it by following that path. The reason is the pull of preyas. The knower, despite however strong the attraction, does not fall prey to it and stands firm. He decides courageously to take the path of shreyas. But the foolish person (manda) falls prey to the temporary pull of preyas and ruins his life. He thinks life is only income and expenditure, earning and saving — and chasing the pleasant, abandons the beneficial.</w:t>
+        <w:t>Generally these śreyas and preyas sit in a person's mind and trouble them. Then the wise person, after analysing well what is needed and what is not, takes a decision with discernment. This person is courageous — he has the wisdom: 'I want what is beneficial, not what is merely pleasant; I must not fall into this attraction.' This is very difficult. Generally a person knows what is bad. But even knowing this, more people fall prey to it by following that path. The reason is the pull of preyas. The knower, despite however strong the attraction, does not fall prey to it and stands firm. He decides courageously to take the path of śreyas. But the foolish person (manda) falls prey to the temporary pull of preyas and ruins his life. He thinks life is only income and expenditure, earning and saving — and chasing the pleasant, abandons the beneficial.</w:t>
       </w:r>
     </w:p>
     <w:p>
@@ -3697,7 +3697,7 @@
           <w:i/>
           <w:sz w:val="19"/>
         </w:rPr>
-        <w:t>Source: Bannanje Govindacharya's Upanishad Discourses                                           Page 28</w:t>
+        <w:t>Source: Bannanje Govindacharya's Upaniṣad Discourses                                           Page 28</w:t>
       </w:r>
     </w:p>
     <w:p>
@@ -3725,7 +3725,7 @@
         <w:jc w:val="left"/>
       </w:pPr>
       <w:r>
-        <w:t>Nachiketa here knew all these matters. Therefore he did not fall prey to any temptation.</w:t>
+        <w:t>Naciketā here knew all these matters. Therefore he did not fall prey to any temptation.</w:t>
       </w:r>
     </w:p>
     <w:p>
@@ -3798,7 +3798,7 @@
           <w:i/>
           <w:sz w:val="22"/>
         </w:rPr>
-        <w:t>[You, O Nachiketa, contemplating the pleasant and fair-appearing desires, you renounced them. You did not grasp this chain of wealth into which many humans sink. ||3||]</w:t>
+        <w:t>[You, O Naciketā, contemplating the pleasant and fair-appearing desires, you renounced them. You did not grasp this chain of wealth into which many humans sink. ||3||]</w:t>
       </w:r>
     </w:p>
     <w:p>
@@ -3807,7 +3807,7 @@
         <w:jc w:val="left"/>
       </w:pPr>
       <w:r>
-        <w:t>Yama says: Unlike most people who go after what is pleasant, you did not. Having contemplated the nature of desire from within and without, meditating on the faults and merits within it, recognising the preyas, you discarded it. Even the golden necklace I offered — you declined. "Your greatness is praiseworthy" — Yama thus praises Nachiketa.</w:t>
+        <w:t>Yama says: Unlike most people who go after what is pleasant, you did not. Having contemplated the nature of desire from within and without, meditating on the faults and merits within it, recognising the preyas, you discarded it. Even the golden necklace I offered — you declined. "Your greatness is praiseworthy" — Yama thus praises Naciketā.</w:t>
       </w:r>
     </w:p>
     <w:p>
@@ -3880,7 +3880,7 @@
           <w:i/>
           <w:sz w:val="22"/>
         </w:rPr>
-        <w:t>[Far apart and widely divergent — these two known as ignorance (avidya) and knowledge (vidya). I consider Nachiketa to be desiring knowledge; the many temptations did not distract you. ||4||]</w:t>
+        <w:t>[Far apart and widely divergent — these two known as ignorance (avidyā) and knowledge (vidyā). I consider Naciketā to be desiring knowledge; the many temptations did not distract you. ||4||]</w:t>
       </w:r>
     </w:p>
     <w:p>
@@ -3889,7 +3889,7 @@
         <w:jc w:val="left"/>
       </w:pPr>
       <w:r>
-        <w:t>Yama here explains that many people, falling into temporary craving, give up the path of shreyas and take the path of preyas. Basically there are two paths for the human being: the path of knowledge leading to shreyas, and the path of ignorance that makes one fall prey to temporary attraction. In the world, ignorance is more widespread than knowledge. Ignorant people do not even know that they know nothing. Therefore the ignorant easily fall prey to the pull of preyas. But the wise one, however strong the attraction, does not fall prey to it and stands firm. Therefore fundamentally the choice between shreyas and preyas is connected to knowledge-ignorance, vidya-avidya. These are of mutually opposite nature, giving opposite results, moving in opposite directions. Yama praises Nachiketa: "If you had followed ignorance, you would have moved toward preyas. But since you followed knowledge, shreyas became dear to you. For this reason no desires could distract you."</w:t>
+        <w:t>Yama here explains that many people, falling into temporary craving, give up the path of śreyas and take the path of preyas. Basically there are two paths for the human being: the path of knowledge leading to śreyas, and the path of ignorance that makes one fall prey to temporary attraction. In the world, ignorance is more widespread than knowledge. Ignorant people do not even know that they know nothing. Therefore the ignorant easily fall prey to the pull of preyas. But the wise one, however strong the attraction, does not fall prey to it and stands firm. Therefore fundamentally the choice between śreyas and preyas is connected to knowledge-ignorance, vidyā-avidyā. These are of mutually opposite nature, giving opposite results, moving in opposite directions. Yama praises Naciketā: "If you had followed ignorance, you would have moved toward preyas. But since you followed knowledge, śreyas became dear to you. For this reason no desires could distract you."</w:t>
       </w:r>
     </w:p>
     <w:p>
@@ -3962,7 +3962,7 @@
           <w:i/>
           <w:sz w:val="22"/>
         </w:rPr>
-        <w:t>[Note: Several recent publications print the first line of this shloka as 'avid yayam antare vartamanah' — but this is not the Kathopanishad reading; it belongs to Mundaka Upanishad [1-2-8]. The Kathopanishad reading is 'avidyayam antare veshtya manah'. Similarly 'dandramyamanah pariyanti mudha' is the Kathopanishad reading while 'janghan yamanah pariyanti mudha' is Mundaka's reading.]</w:t>
+        <w:t>[Note: Several recent publications print the first line of this śloka as 'avidyāyām antare vartamānāḥ' — but this is not the Kaṭhopaniṣad reading; it belongs to Mundaka Upaniṣad [1-2-8]. The Kaṭhopaniṣad reading is 'avidyāyām antare veṣṭyamānāḥ'. Similarly 'dandramyamāṇāḥ pariyanti mūḍhāḥ' is the Kaṭhopaniṣad reading while 'jaṅghanyamānāḥ pariyanti mūḍhāḥ' is Mundaka's reading.]</w:t>
       </w:r>
     </w:p>
     <w:p>
@@ -3991,7 +3991,7 @@
           <w:i/>
           <w:sz w:val="19"/>
         </w:rPr>
-        <w:t>Source: Bannanje Govindacharya's Upanishad Discourses                                           Page 29</w:t>
+        <w:t>Source: Bannanje Govindacharya's Upaniṣad Discourses                                           Page 29</w:t>
       </w:r>
     </w:p>
     <w:p>
@@ -4019,7 +4019,7 @@
         <w:jc w:val="left"/>
       </w:pPr>
       <w:r>
-        <w:t>Yama here beautifully and precisely portrays human character. Today everyone is immersed in ignorance. No one has knowledge of the truth. However much we have studied, knowing the fundamental secret of the universe through that is not possible. As the American physicist and scientist Fritjof Capra (author of 'The Tao of Physics') says: "The fundamental truth of the universe will never be known to science. It will remain unknowable forever." The episode of Draupadi's disrobing in the Mahabharata conveys this same message. There, even though Duryodhana and Dushasana denied truth and tried to strip nature (Draupadi) bare, penetrating the mystery proved impossible for them. Therefore the fundamental truth we need to understand is: "We do not know the fundamental truth of the universe." Yama says: "Today everyone has built a fence of ignorance around themselves thinking they are secure. But they are fundamentally those who have wrapped themselves in the fence of ignorance." Those who live this way are described here as 'dandramyamanah' — meaning those who live like trees. A creature born as a tree may be a shelter for others. But there, that creature has no intellectual development for hundreds of years. Similarly, people who think they know everything without knowing anything are like the assembly of the blind leading the blind.</w:t>
+        <w:t>Yama here beautifully and precisely portrays human character. Today everyone is immersed in ignorance. No one has knowledge of the truth. However much we have studied, knowing the fundamental secret of the universe through that is not possible. As the American physicist and scientist Fritjof Capra (author of 'The Tao of Physics') says: "The fundamental truth of the universe will never be known to science. It will remain unknowable forever." The episode of Draupadi's disrobing in the Mahābhārata conveys this same message. There, even though Duryodhana and Dushasana denied truth and tried to strip nature (Draupadi) bare, penetrating the mystery proved impossible for them. Therefore the fundamental truth we need to understand is: "We do not know the fundamental truth of the universe." Yama says: "Today everyone has built a fence of ignorance around themselves thinking they are secure. But they are fundamentally those who have wrapped themselves in the fence of ignorance." Those who live this way are described here as 'dandramyamāṇāḥ' — meaning those who live like trees. A creature born as a tree may be a shelter for others. But there, that creature has no intellectual development for hundreds of years. Similarly, people who think they know everything without knowing anything are like the assembly of the blind leading the blind.</w:t>
       </w:r>
     </w:p>
     <w:p>
@@ -4101,7 +4101,7 @@
         <w:jc w:val="left"/>
       </w:pPr>
       <w:r>
-        <w:t>Yama continues: Those who are childish (foolish) do not know the truth. They always slide downward. From desire for money they constantly commit errors. Those who do not read Vedanta remain childish, and the childish cannot understand Vedanta. Even if they accept God, they have no concern for God. Deluded by desire for money, they lose faith in the afterlife, God, liberation — believing that only what they can see is the world and nothing lies beyond it [or that this world too is illusion, the afterlife too is illusion, only 'I' am the truth]. The result is that they revolve perpetually in the cycle of birth and death.</w:t>
+        <w:t>Yama continues: Those who are childish (foolish) do not know the truth. They always slide downward. From desire for money they constantly commit errors. Those who do not read Vedānta remain childish, and the childish cannot understand Vedānta. Even if they accept God, they have no concern for God. Deluded by desire for money, they lose faith in the afterlife, God, liberation — believing that only what they can see is the world and nothing lies beyond it [or that this world too is illusion, the afterlife too is illusion, only 'I' am the truth]. The result is that they revolve perpetually in the cycle of birth and death.</w:t>
       </w:r>
     </w:p>
     <w:p>
@@ -4183,7 +4183,7 @@
         <w:jc w:val="left"/>
       </w:pPr>
       <w:r>
-        <w:t>Thinking that listening to Vedanta will make spiritual practice easy — that is not the case. Yama says: "Often when one wants to understand spirituality there are no teachers to be found; and when teachers are available, one does not feel like listening." Thus the very opportunity to listen does not come to many people in their entire lifetime. Some lack the fortune to hear; others, even having heard, do not understand. When someone talks about spirituality and the Vedas and Upanishads — that is a wonder. If God has given such ability to anyone, that is their fortune. Even listening to what has been said is a fortune; understanding it is wonderful; learning from a learned expert is yet another marvel.</w:t>
+        <w:t>Thinking that listening to Vedānta will make spiritual practice easy — that is not the case. Yama says: "Often when one wants to understand spirituality there are no teachers to be found; and when teachers are available, one does not feel like listening." Thus the very opportunity to listen does not come to many people in their entire lifetime. Some lack the fortune to hear; others, even having heard, do not understand. When someone talks about spirituality and the Vedas and Upaniṣads — that is a wonder. If God has given such ability to anyone, that is their fortune. Even listening to what has been said is a fortune; understanding it is wonderful; learning from a learned expert is yet another marvel.</w:t>
       </w:r>
     </w:p>
     <w:p>
@@ -4197,7 +4197,7 @@
           <w:i/>
           <w:sz w:val="19"/>
         </w:rPr>
-        <w:t>Source: Bannanje Govindacharya's Upanishad Discourses                                           Page 30</w:t>
+        <w:t>Source: Bannanje Govindacharya's Upaniṣad Discourses                                           Page 30</w:t>
       </w:r>
     </w:p>
     <w:p>
@@ -4371,7 +4371,7 @@
           <w:i/>
           <w:sz w:val="22"/>
         </w:rPr>
-        <w:t>[This wisdom cannot be attained by logic; taught by another it is rightly understood. O dear one, you have obtained it; you are firm in truth. May we have many questioners like you, O Nachiketa! ||9||]</w:t>
+        <w:t>[This wisdom cannot be attained by logic; taught by another it is rightly understood. O dear one, you have obtained it; you are firm in truth. May we have many questioners like you, O Naciketā! ||9||]</w:t>
       </w:r>
     </w:p>
     <w:p>
@@ -4380,7 +4380,7 @@
         <w:jc w:val="left"/>
       </w:pPr>
       <w:r>
-        <w:t>It is impossible to either deny God through logic or prove God's existence through it. Knowledge of the Self cannot be obtained through logic. This is to be known from those who know God's greatness, and to be understood through experience. O Nachiketa, you are not one who followed logic. You are one with firm trust in God. Yama praises Nachiketa: "May we receive students with the aspiration to understand spirituality through experience, like you."</w:t>
+        <w:t>It is impossible to either deny God through logic or prove God's existence through it. Knowledge of the Self cannot be obtained through logic. This is to be known from those who know God's greatness, and to be understood through experience. O Naciketā, you are not one who followed logic. You are one with firm trust in God. Yama praises Naciketā: "May we receive students with the aspiration to understand spirituality through experience, like you."</w:t>
       </w:r>
     </w:p>
     <w:p>
@@ -4467,7 +4467,7 @@
           <w:i/>
           <w:sz w:val="19"/>
         </w:rPr>
-        <w:t>Source: Bannanje Govindacharya's Upanishad Discourses                                           Page 31</w:t>
+        <w:t>Source: Bannanje Govindacharya's Upaniṣad Discourses                                           Page 31</w:t>
       </w:r>
     </w:p>
     <w:p>
@@ -4495,7 +4495,7 @@
         <w:jc w:val="left"/>
       </w:pPr>
       <w:r>
-        <w:t>For those without faith in God, however many scriptures they study, knowledge of God does not come. Even atheists who have no yearning to know God — however many religious texts they study, God does not become clear to them. Having resolved that there is no God, whatever study one undertakes, grasping it is impossible. God is the eternal truth. If there is no alertness to know Him, the awareness of that eternal truth does not arise. Therefore only one who has faith in God can potentially understand God. So we first need faith; from that comes the aspiration to know; when understood, our faith becomes firm; from this it becomes possible to know more. "I too, through the Agni-vidya I taught you, worshipped the Lord. Always filling my mind with the Lord denoted by 'A', I dedicated my senses to the Lord's service. Thereby my senses moved toward the Lord. Thus, seated in an impermanent chariot, I journeyed toward the eternal and obtained knowledge of the Lord," says Yama.</w:t>
+        <w:t>For those without faith in God, however many scriptures they study, knowledge of God does not come. Even atheists who have no yearning to know God — however many religious texts they study, God does not become clear to them. Having resolved that there is no God, whatever study one undertakes, grasping it is impossible. God is the eternal truth. If there is no alertness to know Him, the awareness of that eternal truth does not arise. Therefore only one who has faith in God can potentially understand God. So we first need faith; from that comes the aspiration to know; when understood, our faith becomes firm; from this it becomes possible to know more. "I too, through the Agni-vidyā I taught you, worshipped the Lord. Always filling my mind with the Lord denoted by 'A', I dedicated my senses to the Lord's service. Thereby my senses moved toward the Lord. Thus, seated in an impermanent chariot, I journeyed toward the eternal and obtained knowledge of the Lord," says Yama.</w:t>
       </w:r>
     </w:p>
     <w:p>
@@ -4568,7 +4568,7 @@
           <w:i/>
           <w:sz w:val="22"/>
         </w:rPr>
-        <w:t>["For attaining desire's fulfillment, the foundation of the world, the endlessness of sacrifice, the farther shore of fearlessness, the great expansive hymn and its foundation — having seen all this, O courageous Nachiketa, you discarded them through resolve." ||11||]</w:t>
+        <w:t>["For attaining desire's fulfillment, the foundation of the world, the endlessness of sacrifice, the farther shore of fearlessness, the great expansive hymn and its foundation — having seen all this, O courageous Naciketā, you discarded them through resolve." ||11||]</w:t>
       </w:r>
     </w:p>
     <w:p>
@@ -4668,7 +4668,7 @@
         <w:jc w:val="left"/>
       </w:pPr>
       <w:r>
-        <w:t>The Lord is a treasure of knowledge and bliss. It is impossible to see Him with our physical eyes. He dwells secretly in the heart-cave of all creatures. Such a Being is the most ancient (purana) — meaning the most primordial. He existed when nothing else existed, and after creation He filled the universe and the individual body as the inner controller. The only means to know such an indwelling Lord is the awareness of adhyatma. Once the awareness of the Lord comes, we can transcend ordinary worldly joy and sorrow. In such a state, the happiness of inherent bliss (svarupananda) is obtained.</w:t>
+        <w:t>The Lord is a treasure of knowledge and bliss. It is impossible to see Him with our physical eyes. He dwells secretly in the heart-cave of all creatures. Such a Being is the most ancient (purāṇa) — meaning the most primordial. He existed when nothing else existed, and after creation He filled the universe and the individual body as the inner controller. The only means to know such an indwelling Lord is the awareness of adhyatma. Once the awareness of the Lord comes, we can transcend ordinary worldly joy and sorrow. In such a state, the happiness of inherent bliss (svarupananda) is obtained.</w:t>
       </w:r>
     </w:p>
     <w:p>
@@ -4682,7 +4682,7 @@
           <w:i/>
           <w:sz w:val="19"/>
         </w:rPr>
-        <w:t>Source: Bannanje Govindacharya's Upanishad Discourses                                           Page 32</w:t>
+        <w:t>Source: Bannanje Govindacharya's Upaniṣad Discourses                                           Page 32</w:t>
       </w:r>
     </w:p>
     <w:p>
@@ -4710,7 +4710,7 @@
         <w:jc w:val="left"/>
       </w:pPr>
       <w:r>
-        <w:t>"Such a state you have attained" — Yama praises Nachiketa.</w:t>
+        <w:t>"Such a state you have attained" — Yama praises Naciketā.</w:t>
       </w:r>
     </w:p>
     <w:p>
@@ -4783,7 +4783,7 @@
           <w:i/>
           <w:sz w:val="22"/>
         </w:rPr>
-        <w:t>[A mortal who has heard and fully absorbed this, who has separated and grasped this subtle righteous element — he rejoices, having obtained what is worth rejoicing over. To Nachiketa I consider the abode opened wide. ||13||]</w:t>
+        <w:t>[A mortal who has heard and fully absorbed this, who has separated and grasped this subtle righteous element — he rejoices, having obtained what is worth rejoicing over. To Naciketā I consider the abode opened wide. ||13||]</w:t>
       </w:r>
     </w:p>
     <w:p>
@@ -4792,7 +4792,7 @@
         <w:jc w:val="left"/>
       </w:pPr>
       <w:r>
-        <w:t>The word 'samparigrhya' (fully absorbed) is used in this shloka. Parigrahya means to make one's own — to internalise. Having listened and understood, recognising the true path, going on that path. Taking in what is appropriate is samparigrahya. Similarly, 'pravrihya' (separated) is used here. Pravrihya means knowing by separating. The endeavour to seek a truth other than the world we know; recognising that beyond the life-principle there is another power that controls life — this is pravrihya.</w:t>
+        <w:t>The word 'samparigrhya' (fully absorbed) is used in this śloka. Parigrahya means to make one's own — to internalise. Having listened and understood, recognising the true path, going on that path. Taking in what is appropriate is samparigrahya. Similarly, 'pravrihya' (separated) is used here. Pravrihya means knowing by separating. The endeavour to seek a truth other than the world we know; recognising that beyond the life-principle there is another power that controls life — this is pravrihya.</w:t>
       </w:r>
     </w:p>
     <w:p>
@@ -4801,7 +4801,7 @@
         <w:jc w:val="left"/>
       </w:pPr>
       <w:r>
-        <w:t>Having heard and understood spiritual matters, recognising the true path, separating out the entire material world graspable by the mind, recognising an extra-natural, non-material power unique from the life-principle itself, the Lord who upholds the entire world — when known through the companionship and service of the wise, realisation of the Lord occurs. This is the experience of real bliss. "The door of such a house of bliss has opened for Nachiketa," says Yama.</w:t>
+        <w:t>Having heard and understood spiritual matters, recognising the true path, separating out the entire material world graspable by the mind, recognising an extra-natural, non-material power unique from the life-principle itself, the Lord who upholds the entire world — when known through the companionship and service of the wise, realisation of the Lord occurs. This is the experience of real bliss. "The door of such a house of bliss has opened for Naciketā," says Yama.</w:t>
       </w:r>
     </w:p>
     <w:p>
@@ -4883,7 +4883,7 @@
         <w:jc w:val="left"/>
       </w:pPr>
       <w:r>
-        <w:t>Having heard Yama's words of praise, Nachiketa says: "I do not need any of your praise. I need the answer to the question I asked. Explain to me the state beyond dharma and adharma in the world, a state without the confusion of sin and merit. Tell me of the principle beyond cause-and-effect, beyond dharma and adharma, the principle you have seen." Here we can clearly see that Nachiketa, undisturbed by Yama's praise, directly reveals his thirst for knowledge to Yama. Seeing Nachiketa's firm mind, Yama directly answers his question in the next shloka.</w:t>
+        <w:t>Having heard Yama's words of praise, Naciketā says: "I do not need any of your praise. I need the answer to the question I asked. Explain to me the state beyond dharma and adharma in the world, a state without the confusion of sin and merit. Tell me of the principle beyond cause-and-effect, beyond dharma and adharma, the principle you have seen." Here we can clearly see that Naciketā, undisturbed by Yama's praise, directly reveals his thirst for knowledge to Yama. Seeing Naciketā's firm mind, Yama directly answers his question in the next śloka.</w:t>
       </w:r>
     </w:p>
     <w:p>
@@ -4965,7 +4965,7 @@
         <w:jc w:val="left"/>
       </w:pPr>
       <w:r>
-        <w:t>Answering Nachiketa's question, Yama says: "That which all the Vedas propound, in whom all logic culminates, desiring whom they practice brahmacharya — that state I tell you in brief: it is 'Om'."</w:t>
+        <w:t>Answering Naciketā's question, Yama says: "That which all the Vedas propound, in whom all logic culminates, desiring whom they practice brahmacharya — that state I tell you in brief: it is 'oṃ'."</w:t>
       </w:r>
     </w:p>
     <w:p>
@@ -4979,7 +4979,7 @@
           <w:i/>
           <w:sz w:val="19"/>
         </w:rPr>
-        <w:t>Source: Bannanje Govindacharya's Upanishad Discourses                                           Page 33</w:t>
+        <w:t>Source: Bannanje Govindacharya's Upaniṣad Discourses                                           Page 33</w:t>
       </w:r>
     </w:p>
     <w:p>
@@ -5007,7 +5007,7 @@
         <w:jc w:val="left"/>
       </w:pPr>
       <w:r>
-        <w:t>Here Yama has said: "All the Vedas ultimately speak of nothing other than the supreme Lord." The names appearing in the Veda such as Agni, Varuna, Mitra, Vayu, etc. are fundamentally names of the Lord. Vedavyasa composed the Sahasranama text specifically to make this known to us. All texts of all languages, all castes, all inquiries into God — they all speak of one and the same God. All the intellectuals of the world, all arguments — they all prove the existence of God. The culmination of logic is only the Lord. For this reason Yama says: "Desiring the Lord, journey toward the Lord through brahmacharya." [Here brahmacharya means: (1) Physical sense-restraint; (2) sense-restraint for Vedic study that reveals the Lord; (3) journeying toward the Lord through study — and so on.]</w:t>
+        <w:t>Here Yama has said: "All the Vedas ultimately speak of nothing other than the supreme Lord." The names appearing in the Veda such as Agni, Varuna, Mitra, Vāyu, etc. are fundamentally names of the Lord. Vedavyasa composed the Sahasranama text specifically to make this known to us. All texts of all languages, all castes, all inquiries into God — they all speak of one and the same God. All the intellectuals of the world, all arguments — they all prove the existence of God. The culmination of logic is only the Lord. For this reason Yama says: "Desiring the Lord, journey toward the Lord through brahmacharya." [Here brahmacharya means: (1) Physical sense-restraint; (2) sense-restraint for Vedic study that reveals the Lord; (3) journeying toward the Lord through study — and so on.]</w:t>
       </w:r>
     </w:p>
     <w:p>
@@ -5016,7 +5016,7 @@
         <w:jc w:val="left"/>
       </w:pPr>
       <w:r>
-        <w:t>Yama has said: "I tell you the seed-syllable that the entire Vedic literature speaks, that expands the Lord's glory: it is 'Om'." 'Om' is the name exclusively reserved for the Lord. It is not used for any person or deity. It is the special name of the Lord. 'Om' is the seed-syllable of all Vedic literature. All meanings of all the Vedas are contained within it. For Jains, Buddhists, and the various branches of Hinduism, 'Om' is the root seed-syllable. The 'Amin' and 'Ommi' used by foreigners are also originally corrupted forms of the Sanskrit 'Om'. Thus the omnipresent Omkara in all its forms is the word that speaks of God.</w:t>
+        <w:t>Yama has said: "I tell you the seed-syllable that the entire Vedic literature speaks, that expands the Lord's glory: it is 'oṃ'." 'oṃ' is the name exclusively reserved for the Lord. It is not used for any person or deity. It is the special name of the Lord. 'oṃ' is the seed-syllable of all Vedic literature. All meanings of all the Vedas are contained within it. For Jains, Buddhists, and the various branches of Hinduism, 'oṃ' is the root seed-syllable. The 'Amin' and 'Ommi' used by foreigners are also originally corrupted forms of the Sanskrit 'oṃ'. Thus the omnipresent Oṃkāra in all its forms is the word that speaks of God.</w:t>
       </w:r>
     </w:p>
     <w:p>
@@ -5098,7 +5098,7 @@
         <w:jc w:val="left"/>
       </w:pPr>
       <w:r>
-        <w:t>The Omkara that speaks of the Supreme Being who is the greatest of meanings, who is denoted by the syllable, is the greatest syllable among syllables. The word 'akshara' (syllable/imperishable) in this shloka has special meaning. From God's perspective: 'ashnute iti aksharah' — meaning one who pervades everywhere; 'a+kshara = akshara' — meaning the imperishable principle; 'adhikam ksharati iti aksharah' — meaning the fulfiller of all wishes; 'aksha+ra = akshara' — meaning one who dwells in the senses (aksha) and controls them while revelling. 'a+ksha+ra': here 'a' means not/without — there is no defect in God; 'ksha' means kshiti or supporter — God is the support of all; 'ra' means to revel — God who creates and dissolves is ever blissful. Those who worship with absorption on the Omkara-denoted Lord obtain what they desire.</w:t>
+        <w:t>The Oṃkāra that speaks of the Supreme Being who is the greatest of meanings, who is denoted by the syllable, is the greatest syllable among syllables. The word 'akshara' (syllable/imperishable) in this śloka has special meaning. From God's perspective: 'ashnute iti aksharah' — meaning one who pervades everywhere; 'a+kshara = akshara' — meaning the imperishable principle; 'adhikam ksharati iti aksharah' — meaning the fulfiller of all wishes; 'aksha+ra = akshara' — meaning one who dwells in the senses (aksha) and controls them while revelling. 'a+ksha+ra': here 'a' means not/without — there is no defect in God; 'ksha' means kshiti or supporter — God is the support of all; 'ra' means to revel — God who creates and dissolves is ever blissful. Those who worship with absorption on the Oṃkāra-denoted Lord obtain what they desire.</w:t>
       </w:r>
     </w:p>
     <w:p>
@@ -5112,7 +5112,7 @@
           <w:i/>
           <w:sz w:val="19"/>
         </w:rPr>
-        <w:t>Source: Bannanje Govindacharya's Upanishad Discourses                                           Page 34</w:t>
+        <w:t>Source: Bannanje Govindacharya's Upaniṣad Discourses                                           Page 34</w:t>
       </w:r>
     </w:p>
     <w:p>
@@ -5140,7 +5140,7 @@
         <w:jc w:val="left"/>
       </w:pPr>
       <w:r>
-        <w:t>Omkara is the wish-granting tree (kalpa vriksha) that gives what is desired. Among mantras there is no equal to this. But here purity of mind and concentration are very important. What gives results is not the utterance of the lips but the absorption of the mind. An important point here is: it is not appropriate to worship the Omkara — the wish-granting tree that gives infinite results — desiring only limited results.</w:t>
+        <w:t>Oṃkāra is the wish-granting tree (kalpa vriksha) that gives what is desired. Among mantras there is no equal to this. But here purity of mind and concentration are very important. What gives results is not the utterance of the lips but the absorption of the mind. An important point here is: it is not appropriate to worship the Oṃkāra — the wish-granting tree that gives infinite results — desiring only limited results.</w:t>
       </w:r>
     </w:p>
     <w:p>
@@ -5222,7 +5222,7 @@
         <w:jc w:val="left"/>
       </w:pPr>
       <w:r>
-        <w:t>The Lord who is the greatest of all is the most unique, the supreme support for the world. If one worships through Omkara and gratefully knows the Lord who is the very foundation of this world — "You shall release all your worldly bonds and join the Lord in Vaikuntha," says Yama.</w:t>
+        <w:t>The Lord who is the greatest of all is the most unique, the supreme support for the world. If one worships through Oṃkāra and gratefully knows the Lord who is the very foundation of this world — "You shall release all your worldly bonds and join the Lord in Vaikuntha," says Yama.</w:t>
       </w:r>
     </w:p>
     <w:p>
@@ -5400,7 +5400,7 @@
           <w:i/>
           <w:sz w:val="19"/>
         </w:rPr>
-        <w:t>Source: Bannanje Govindacharya's Upanishad Discourses                                           Page 35</w:t>
+        <w:t>Source: Bannanje Govindacharya's Upaniṣad Discourses                                           Page 35</w:t>
       </w:r>
     </w:p>
     <w:p>
@@ -5501,7 +5501,7 @@
           <w:i/>
           <w:sz w:val="22"/>
         </w:rPr>
-        <w:t>[Subtler than the subtle, greater than the great — the Atman is placed in the cave of a creature. One free from desires sees His greatness, becoming free from sorrow through the Lord's grace. ||20||]</w:t>
+        <w:t>[Subtler than the subtle, greater than the great — the Ātman is placed in the cave of a creature. One free from desires sees His greatness, becoming free from sorrow through the Lord's grace. ||20||]</w:t>
       </w:r>
     </w:p>
     <w:p>
@@ -5510,7 +5510,7 @@
         <w:jc w:val="left"/>
       </w:pPr>
       <w:r>
-        <w:t>The Lord who is greatest of the great dwells in the heart-cave of the soul-nature as subtler than the subtle. The soul that is repeatedly born and dies in bodily form — to conquer death, must first see the Supreme Self dwelling in one's own inner self. Whoever's mind steadily settles in the Lord denoted by 'A' becomes free from all sorrows. Therefore rather than fixing the mind on worldly matters and grieving, one can settle the mind on the Lord and escape from worry. Only when God who dwells within us and upholds us bestows grace can we know Him. One who knows God thus can reach Him. "See Him with the inner eye through God's grace; from that comes grief-free liberation," Yama instructs Nachiketa.</w:t>
+        <w:t>The Lord who is greatest of the great dwells in the heart-cave of the soul-nature as subtler than the subtle. The soul that is repeatedly born and dies in bodily form — to conquer death, must first see the Supreme Self dwelling in one's own inner self. Whoever's mind steadily settles in the Lord denoted by 'A' becomes free from all sorrows. Therefore rather than fixing the mind on worldly matters and grieving, one can settle the mind on the Lord and escape from worry. Only when God who dwells within us and upholds us bestows grace can we know Him. One who knows God thus can reach Him. "See Him with the inner eye through God's grace; from that comes grief-free liberation," Yama instructs Naciketā.</w:t>
       </w:r>
     </w:p>
     <w:p>
@@ -5592,7 +5592,7 @@
         <w:jc w:val="left"/>
       </w:pPr>
       <w:r>
-        <w:t>God is somewhere in one place. But not only there — even if you go far away, He is there too. In the gross view, like space. In the original form, eternally visible and seated in states like Vaikuntha. But from there He also travels elsewhere — this speaks of God's omnipotence and omnipresence. [Here 'space' is only a gross illustration. Space is only omnipresent but not omnipotent.] The Lord who lies as subtler than the subtle within our heart-cave is filled everywhere as the greatest of the great. God gives joy and sorrow to living beings according to the qualification of their soul-nature. "No human being below me can know this special quality of such a God." [The word 'ka' that appears here indicates Brahma and Vayu. "Only deities above me can know it" — this is another meaning visible here.] "You had the fortune to know this knowledge, therefore you came to me. You are fortunate. What is greater than this secret, it is not possible to understand in the human world. I knew the secret that generally no one comes to understand, and gave it to you. In the human world, you are the first to know it; I am the one who gave it," says Yama.</w:t>
+        <w:t>God is somewhere in one place. But not only there — even if you go far away, He is there too. In the gross view, like space. In the original form, eternally visible and seated in states like Vaikuntha. But from there He also travels elsewhere — this speaks of God's omnipotence and omnipresence. [Here 'space' is only a gross illustration. Space is only omnipresent but not omnipotent.] The Lord who lies as subtler than the subtle within our heart-cave is filled everywhere as the greatest of the great. God gives joy and sorrow to living beings according to the qualification of their soul-nature. "No human being below me can know this special quality of such a God." [The word 'ka' that appears here indicates Brahma and Vāyu. "Only deities above me can know it" — this is another meaning visible here.] "You had the fortune to know this knowledge, therefore you came to me. You are fortunate. What is greater than this secret, it is not possible to understand in the human world. I knew the secret that generally no one comes to understand, and gave it to you. In the human world, you are the first to know it; I am the one who gave it," says Yama.</w:t>
       </w:r>
     </w:p>
     <w:p>
@@ -5606,7 +5606,7 @@
           <w:i/>
           <w:sz w:val="19"/>
         </w:rPr>
-        <w:t>Source: Bannanje Govindacharya's Upanishad Discourses                                           Page 36</w:t>
+        <w:t>Source: Bannanje Govindacharya's Upaniṣad Discourses                                           Page 36</w:t>
       </w:r>
     </w:p>
     <w:p>
@@ -5698,7 +5698,7 @@
           <w:i/>
           <w:sz w:val="22"/>
         </w:rPr>
-        <w:t>[The bodiless dwelling in bodies, the stable dwelling in the unstable — knowing the great, all-pervading Atman, the courageous one does not grieve. ||22||]</w:t>
+        <w:t>[The bodiless dwelling in bodies, the stable dwelling in the unstable — knowing the great, all-pervading Ātman, the courageous one does not grieve. ||22||]</w:t>
       </w:r>
     </w:p>
     <w:p>
@@ -5707,7 +5707,7 @@
         <w:jc w:val="left"/>
       </w:pPr>
       <w:r>
-        <w:t>A question common to all is: Does God have a body or form? This shloka is in the form of an answer to our question:</w:t>
+        <w:t>A question common to all is: Does God have a body or form? This śloka is in the form of an answer to our question:</w:t>
       </w:r>
     </w:p>
     <w:p>
@@ -5798,7 +5798,7 @@
           <w:i/>
           <w:sz w:val="22"/>
         </w:rPr>
-        <w:t>[This Atman is not obtainable through lectures, nor by intellect, nor by extensive learning. He is obtained by the one He chooses. To that one the Atman reveals His own form. ||23||]</w:t>
+        <w:t>[This Ātman is not obtainable through lectures, nor by intellect, nor by extensive learning. He is obtained by the one He chooses. To that one the Ātman reveals His own form. ||23||]</w:t>
       </w:r>
     </w:p>
     <w:p>
@@ -5879,7 +5879,7 @@
           <w:i/>
           <w:sz w:val="19"/>
         </w:rPr>
-        <w:t>Source: Bannanje Govindacharya's Upanishad Discourses                                           Page 37</w:t>
+        <w:t>Source: Bannanje Govindacharya's Upaniṣad Discourses                                           Page 37</w:t>
       </w:r>
     </w:p>
     <w:p>
@@ -6022,7 +6022,7 @@
         <w:jc w:val="left"/>
       </w:pPr>
       <w:r>
-        <w:t>The entire universe at the time of dissolution is like one morsel of food for God. The deity of the Brahmin varna — four-faced Brahma, the deity of the Kshatriya varna — Vayu — are at dissolution like one morsel of food for the Lord. Death (Garuda-Shesha-Rudra), Yama who is death for all beings in the earthly world — at dissolution these are like the condiment mixed into the Lord's meal. "Who is there who has known the greatness of such a God?" says Yama. Even a little awareness of God's complete vision is only within Brahma-Vayu (ka). "I tell you what I know of such a God" — this sentiment is expressed in this shloka.</w:t>
+        <w:t>The entire universe at the time of dissolution is like one morsel of food for God. The deity of the Brahmin varna — four-faced Brahma, the deity of the Kshatriya varna — Vāyu — are at dissolution like one morsel of food for the Lord. Death (Garuda-Shesha-Rudra), Yama who is death for all beings in the earthly world — at dissolution these are like the condiment mixed into the Lord's meal. "Who is there who has known the greatness of such a God?" says Yama. Even a little awareness of God's complete vision is only within Brahma-Vāyu (ka). "I tell you what I know of such a God" — this sentiment is expressed in this śloka.</w:t>
       </w:r>
     </w:p>
     <w:p>
@@ -6057,7 +6057,7 @@
           <w:i/>
           <w:sz w:val="19"/>
         </w:rPr>
-        <w:t>Source: Bannanje Govindacharya's Upanishad Discourses                                           Page 38</w:t>
+        <w:t>Source: Bannanje Govindacharya's Upaniṣad Discourses                                           Page 38</w:t>
       </w:r>
     </w:p>
     <w:p>
@@ -6085,7 +6085,7 @@
         <w:jc w:val="left"/>
       </w:pPr>
       <w:r>
-        <w:t>Valli 3</w:t>
+        <w:t>Vallī 3</w:t>
       </w:r>
     </w:p>
     <w:p>
@@ -6158,7 +6158,7 @@
           <w:i/>
           <w:sz w:val="22"/>
         </w:rPr>
-        <w:t>[The two who drink the fruit of righteous deeds in the world of the meritorious, entered the cave in the highest transcendent realm — the knowers of Brahman call them shadow and sunlight, as do those who perform the five fires and the triple Nachiketa fire. ||1||]</w:t>
+        <w:t>[The two who drink the fruit of righteous deeds in the world of the meritorious, entered the cave in the highest transcendent realm — the knowers of Brahman call them shadow and sunlight, as do those who perform the five fires and the triple Naciketā fire. ||1||]</w:t>
       </w:r>
     </w:p>
     <w:p>
@@ -6167,7 +6167,7 @@
         <w:jc w:val="left"/>
       </w:pPr>
       <w:r>
-        <w:t>In this shloka "guham pravishhtau" means two are within the cave. Who these two are the Upanishad does not say explicitly anywhere. Therefore most people are confused by this shloka. Vedavyasa composed a sutra for the determination of this mantra: "guham pravishtavAtmAnau taddarSanAt" (Vedanta Sutra 1.2.11). This makes clear that the Lord dwells in the heart-cave in two forms. As the scriptures say: "Atma antaAtmeti harih eka eva dvidhAsthitah" — meaning the Lord dwells in our heart-cave as 'Atma' and 'AntarAtma' by name, in two forms.</w:t>
+        <w:t>In this śloka "guhāṃ praviṣṭau" means two are within the cave. Who these two are the Upaniṣad does not say explicitly anywhere. Therefore most people are confused by this śloka. Vedavyasa composed a sutra for the determination of this mantra: "guhāṃ praviṣṭāvātmānau taddarśanāt" (Vedānta Sutra 1.2.11). This makes clear that the Lord dwells in the heart-cave in two forms. As the scriptures say: "ātmā antarātmeti hariḥ eka eva dvidhā sthitaḥ" — meaning the Lord dwells in our heart-cave as 'Ātmā' and 'Antarātmā' by name, in two forms.</w:t>
       </w:r>
     </w:p>
     <w:p>
@@ -6176,7 +6176,7 @@
         <w:jc w:val="left"/>
       </w:pPr>
       <w:r>
-        <w:t>Here the cave means our heart-cave — the Anahata chakra (thymus gland), the energy centre in the centre of the lotus heart. There, holding the soul-nature, the Lord dwells outside the soul-nature as 'Atma' and inside the soul-nature as 'AntarAtma'. He drinks the fruit of all righteous actions and bliss, savours the experience of the senses blissfully, and while sharing that blissful portion with us too, He dwells there. The human body obtained as the fruit of merit is the Lord's house. The lotus heart at its centre is the Lord's inner chamber — His abode.</w:t>
+        <w:t>Here the cave means our heart-cave — the Anahata chakra (thymus gland), the energy centre in the centre of the lotus heart. There, holding the soul-nature, the Lord dwells outside the soul-nature as 'Ātmā' and inside the soul-nature as 'Antarātmā'. He drinks the fruit of all righteous actions and bliss, savours the experience of the senses blissfully, and while sharing that blissful portion with us too, He dwells there. The human body obtained as the fruit of merit is the Lord's house. The lotus heart at its centre is the Lord's inner chamber — His abode.</w:t>
       </w:r>
     </w:p>
     <w:p>
@@ -6249,7 +6249,7 @@
           <w:i/>
           <w:sz w:val="22"/>
         </w:rPr>
-        <w:t>[We are able to cross over to the Nachiketa fire — He who is the bridge for sacrificers, the Imperishable Brahman, the Supreme, the shore of fearlessness for those wishing to cross. ||2||]</w:t>
+        <w:t>[We are able to cross over to the Naciketā fire — He who is the bridge for sacrificers, the Imperishable Brahman, the Supreme, the shore of fearlessness for those wishing to cross. ||2||]</w:t>
       </w:r>
     </w:p>
     <w:p>
@@ -6263,7 +6263,7 @@
           <w:i/>
           <w:sz w:val="19"/>
         </w:rPr>
-        <w:t>Source: Bannanje Govindacharya's Upanishad Discourses                                           Page 39</w:t>
+        <w:t>Source: Bannanje Govindacharya's Upaniṣad Discourses                                           Page 39</w:t>
       </w:r>
     </w:p>
     <w:p>
@@ -6468,7 +6468,7 @@
         <w:jc w:val="left"/>
       </w:pPr>
       <w:r>
-        <w:t>Without the grace of Shiva, the presiding deity of the mind, concentration is not possible. Without the help of Surya and Chandra, the presiding deities of the senses, the journey toward the Lord is not possible. With the help of the deities, using the body of practice, journeying toward the Lord — this is another inner meaning of this shloka.</w:t>
+        <w:t>Without the grace of Shiva, the presiding deity of the mind, concentration is not possible. Without the help of Surya and Chandra, the presiding deities of the senses, the journey toward the Lord is not possible. With the help of the deities, using the body of practice, journeying toward the Lord — this is another inner meaning of this śloka.</w:t>
       </w:r>
     </w:p>
     <w:p>
@@ -6637,7 +6637,7 @@
           <w:i/>
           <w:sz w:val="19"/>
         </w:rPr>
-        <w:t>Source: Bannanje Govindacharya's Upanishad Discourses                                           Page 41</w:t>
+        <w:t>Source: Bannanje Govindacharya's Upaniṣad Discourses                                           Page 41</w:t>
       </w:r>
     </w:p>
     <w:p>
@@ -6898,7 +6898,7 @@
           <w:i/>
           <w:sz w:val="19"/>
         </w:rPr>
-        <w:t>Source: Bannanje Govindacharya's Upanishad Discourses                                           Page 42</w:t>
+        <w:t>Source: Bannanje Govindacharya's Upaniṣad Discourses                                           Page 42</w:t>
       </w:r>
     </w:p>
     <w:p>
@@ -7048,7 +7048,7 @@
           <w:i/>
           <w:sz w:val="22"/>
         </w:rPr>
-        <w:t>[The objects are beyond the senses; the mind is beyond the objects. The intellect is beyond the mind; the great Atman is beyond the intellect. Beyond the great is the Unmanifest; beyond the Unmanifest is the Purusha. There is nothing beyond the Purusha — that is the end, that is the supreme goal. ||10-11||]</w:t>
+        <w:t>[The objects are beyond the senses; the mind is beyond the objects. The intellect is beyond the mind; the great Ātman is beyond the intellect. Beyond the great is the Unmanifest; beyond the Unmanifest is the Puruṣa. There is nothing beyond the Puruṣa — that is the end, that is the supreme goal. ||10-11||]</w:t>
       </w:r>
     </w:p>
     <w:p>
@@ -7057,7 +7057,7 @@
         <w:jc w:val="left"/>
       </w:pPr>
       <w:r>
-        <w:t>Yama describes the ladder of creation here. The senses are one level; beyond them are the objects of the senses. Beyond the objects is the mind. Beyond the mind is the intellect. Beyond the intellect is the great Atman (the cosmic mind). Beyond that is the Unmanifest (avyakta — primordial matter). And beyond the Unmanifest is the Purusha — the Lord Himself. There is nothing beyond the Lord. He is the ultimate, the supreme goal.</w:t>
+        <w:t>Yama describes the ladder of creation here. The senses are one level; beyond them are the objects of the senses. Beyond the objects is the mind. Beyond the mind is the intellect. Beyond the intellect is the great Ātman (the cosmic mind). Beyond that is the Unmanifest (avyakta — primordial matter). And beyond the Unmanifest is the Puruṣa — the Lord Himself. There is nothing beyond the Lord. He is the ultimate, the supreme goal.</w:t>
       </w:r>
     </w:p>
     <w:p>
@@ -7130,7 +7130,7 @@
           <w:i/>
           <w:sz w:val="22"/>
         </w:rPr>
-        <w:t>[This Atman hidden in all beings does not shine forth. But He is seen by the subtle seers with the sharp and subtle intellect. ||12||]</w:t>
+        <w:t>[This Ātman hidden in all beings does not shine forth. But He is seen by the subtle seers with the sharp and subtle intellect. ||12||]</w:t>
       </w:r>
     </w:p>
     <w:p>
@@ -7144,7 +7144,7 @@
           <w:i/>
           <w:sz w:val="19"/>
         </w:rPr>
-        <w:t>Source: Bannanje Govindacharya's Upanishad Discourses                                           Page 43</w:t>
+        <w:t>Source: Bannanje Govindacharya's Upaniṣad Discourses                                           Page 43</w:t>
       </w:r>
     </w:p>
     <w:p>
@@ -7172,7 +7172,7 @@
         <w:jc w:val="left"/>
       </w:pPr>
       <w:r>
-        <w:t>After the mind comes the intellect. Saraswati and Bharati are the presiding deities of the intellect. Beyond the intellect is the 'great' — the cosmic mind, presided over by Brahma. Beyond that is the Unmanifest. Mula Prakriti (primordial nature), presided over by Mahalakshmi, is the Unmanifest. Beyond all this is the Lord Himself.</w:t>
+        <w:t>After the mind comes the intellect. Sarasvatī and Bharati are the presiding deities of the intellect. Beyond the intellect is the 'great' — the cosmic mind, presided over by Brahma. Beyond that is the Unmanifest. Mula Prakriti (primordial nature), presided over by Mahalakshmi, is the Unmanifest. Beyond all this is the Lord Himself.</w:t>
       </w:r>
     </w:p>
     <w:p>
@@ -7473,7 +7473,7 @@
           <w:i/>
           <w:sz w:val="22"/>
         </w:rPr>
-        <w:t>[Having told and heard the eternal Nachiketa story told by Death, the wise one is honoured in the world of Brahma. ||16||]</w:t>
+        <w:t>[Having told and heard the eternal Naciketā story told by Death, the wise one is honoured in the world of Brahma. ||16||]</w:t>
       </w:r>
     </w:p>
     <w:p>
@@ -7566,7 +7566,7 @@
           <w:i/>
           <w:sz w:val="19"/>
         </w:rPr>
-        <w:t>Source: Bannanje Govindacharya's Upanishad Discourses                                           Page 46</w:t>
+        <w:t>Source: Bannanje Govindacharya's Upaniṣad Discourses                                           Page 46</w:t>
       </w:r>
     </w:p>
     <w:p>
@@ -7600,7 +7600,7 @@
           <w:i/>
           <w:sz w:val="22"/>
         </w:rPr>
-        <w:t>[End of Chapter 1. Thus ends the Katha Upanishad, Chapter 1, Valli 3.]</w:t>
+        <w:t>[End of Chapter 1. Thus ends the Katha Upaniṣad, Chapter 1, Vallī 3.]</w:t>
       </w:r>
     </w:p>
     <w:p>
@@ -7649,7 +7649,7 @@
         <w:jc w:val="left"/>
       </w:pPr>
       <w:r>
-        <w:t>Valli 01</w:t>
+        <w:t>Vallī 01</w:t>
       </w:r>
     </w:p>
     <w:p>
@@ -7891,7 +7891,7 @@
           <w:i/>
           <w:sz w:val="19"/>
         </w:rPr>
-        <w:t>Source: Bannanje Govindacharya's Upanishad Discourses                                           Page 47</w:t>
+        <w:t>Source: Bannanje Govindacharya's Upaniṣad Discourses                                           Page 47</w:t>
       </w:r>
     </w:p>
     <w:p>
@@ -7983,7 +7983,7 @@
           <w:i/>
           <w:sz w:val="22"/>
         </w:rPr>
-        <w:t>[By whom both the dream state and the waking state are seen — knowing that great, all-pervading Atman, the wise one does not grieve. ||4||]</w:t>
+        <w:t>[By whom both the dream state and the waking state are seen — knowing that great, all-pervading Ātman, the wise one does not grieve. ||4||]</w:t>
       </w:r>
     </w:p>
     <w:p>
@@ -8216,7 +8216,7 @@
           <w:i/>
           <w:sz w:val="19"/>
         </w:rPr>
-        <w:t>Source: Bannanje Govindacharya's Upanishad Discourses                                           Page 48</w:t>
+        <w:t>Source: Bannanje Govindacharya's Upaniṣad Discourses                                           Page 48</w:t>
       </w:r>
     </w:p>
     <w:p>
@@ -8404,7 +8404,7 @@
           <w:i/>
           <w:sz w:val="19"/>
         </w:rPr>
-        <w:t>Source: Bannanje Govindacharya's Upanishad Discourses                                           Page 49</w:t>
+        <w:t>Source: Bannanje Govindacharya's Upaniṣad Discourses                                           Page 49</w:t>
       </w:r>
     </w:p>
     <w:p>
@@ -8601,7 +8601,7 @@
           <w:i/>
           <w:sz w:val="19"/>
         </w:rPr>
-        <w:t>Source: Bannanje Govindacharya's Upanishad Discourses                                           Page 50</w:t>
+        <w:t>Source: Bannanje Govindacharya's Upaniṣad Discourses                                           Page 50</w:t>
       </w:r>
     </w:p>
     <w:p>
@@ -8801,7 +8801,7 @@
           <w:i/>
           <w:sz w:val="19"/>
         </w:rPr>
-        <w:t>Source: Bannanje Govindacharya's Upanishad Discourses                                           Page 56</w:t>
+        <w:t>Source: Bannanje Govindacharya's Upaniṣad Discourses                                           Page 56</w:t>
       </w:r>
     </w:p>
     <w:p>
@@ -8835,7 +8835,7 @@
           <w:i/>
           <w:sz w:val="22"/>
         </w:rPr>
-        <w:t>[Thus ends Katha Upanishad, Chapter 2, Valli 1.]</w:t>
+        <w:t>[Thus ends Katha Upaniṣad, Chapter 2, Vallī 1.]</w:t>
       </w:r>
     </w:p>
     <w:p>
@@ -8884,7 +8884,7 @@
         <w:jc w:val="left"/>
       </w:pPr>
       <w:r>
-        <w:t>Valli 02</w:t>
+        <w:t>Vallī 02</w:t>
       </w:r>
     </w:p>
     <w:p>
@@ -9039,7 +9039,7 @@
           <w:i/>
           <w:sz w:val="22"/>
         </w:rPr>
-        <w:t>[He who sits in the pure (sun), the good (air/prana) who sits in the atmosphere, the priest who sits on the altar, the guest who sits in the house — He who dwells among humans, in the best, in truth, in the sky — born of water, born of earth, born of truth, born of mountain — truth, the great. ||2||]</w:t>
+        <w:t>[He who sits in the pure (sun), the good (air/prāṇa) who sits in the atmosphere, the priest who sits on the altar, the guest who sits in the house — He who dwells among humans, in the best, in truth, in the sky — born of water, born of earth, born of truth, born of mountain — truth, the great. ||2||]</w:t>
       </w:r>
     </w:p>
     <w:p>
@@ -9048,7 +9048,7 @@
         <w:jc w:val="left"/>
       </w:pPr>
       <w:r>
-        <w:t>This powerful shloka reveals the omnipresence of the Lord — He is the sun in the sky, He is prana in the body, He is the priest in the yajna, He is the guest in the house. He is everywhere, in everything. Truth and Greatness are His very nature.</w:t>
+        <w:t>This powerful śloka reveals the omnipresence of the Lord — He is the sun in the sky, He is prāṇa in the body, He is the priest in the yajña, He is the guest in the house. He is everywhere, in everything. Truth and Greatness are His very nature.</w:t>
       </w:r>
     </w:p>
     <w:p>
@@ -9062,7 +9062,7 @@
           <w:i/>
           <w:sz w:val="19"/>
         </w:rPr>
-        <w:t>Source: Bannanje Govindacharya's Upanishad Discourses                                           Page 57</w:t>
+        <w:t>Source: Bannanje Govindacharya's Upaniṣad Discourses                                           Page 57</w:t>
       </w:r>
     </w:p>
     <w:p>
@@ -9154,7 +9154,7 @@
           <w:i/>
           <w:sz w:val="22"/>
         </w:rPr>
-        <w:t>[He pushes the prana upward and draws the apana downward. The dwarfish one seated in the middle — all the gods worship Him. ||3||]</w:t>
+        <w:t>[He pushes the prāṇa upward and draws the apāna downward. The dwarfish one seated in the middle — all the gods worship Him. ||3||]</w:t>
       </w:r>
     </w:p>
     <w:p>
@@ -9163,7 +9163,7 @@
         <w:jc w:val="left"/>
       </w:pPr>
       <w:r>
-        <w:t>The breath we breathe is prana going upward; the outbreath is apana going downward. The 'dwarfish one' in the middle is the Lord who controls both. The entire cosmos — all the gods — worship this inner Lord.</w:t>
+        <w:t>The breath we breathe is prāṇa going upward; the outbreath is apāna going downward. The 'dwarfish one' in the middle is the Lord who controls both. The entire cosmos — all the gods — worship this inner Lord.</w:t>
       </w:r>
     </w:p>
     <w:p>
@@ -9309,7 +9309,7 @@
           <w:i/>
           <w:sz w:val="22"/>
         </w:rPr>
-        <w:t>[No mortal lives by prana alone, nor by apana alone. By another in whom both of these rest — by that one they live. ||5||]</w:t>
+        <w:t>[No mortal lives by prāṇa alone, nor by apāna alone. By another in whom both of these rest — by that one they live. ||5||]</w:t>
       </w:r>
     </w:p>
     <w:p>
@@ -9318,7 +9318,7 @@
         <w:jc w:val="left"/>
       </w:pPr>
       <w:r>
-        <w:t>We do not live by the breath itself. Both prana and apana rest in the Lord — and by the Lord, we live. It is His power that animates everything.</w:t>
+        <w:t>We do not live by the breath itself. Both prāṇa and apāna rest in the Lord — and by the Lord, we live. It is His power that animates everything.</w:t>
       </w:r>
     </w:p>
     <w:p>
@@ -9332,7 +9332,7 @@
           <w:i/>
           <w:sz w:val="19"/>
         </w:rPr>
-        <w:t>Source: Bannanje Govindacharya's Upanishad Discourses                                           Page 58</w:t>
+        <w:t>Source: Bannanje Govindacharya's Upaniṣad Discourses                                           Page 58</w:t>
       </w:r>
     </w:p>
     <w:p>
@@ -9424,7 +9424,7 @@
           <w:i/>
           <w:sz w:val="22"/>
         </w:rPr>
-        <w:t>[Now I shall tell you the secret eternal Brahman and what happens to the Atman, O Gautama, on reaching death. ||6||]</w:t>
+        <w:t>[Now I shall tell you the secret eternal Brahman and what happens to the Ātman, O Gautama, on reaching death. ||6||]</w:t>
       </w:r>
     </w:p>
     <w:p>
@@ -9622,7 +9622,7 @@
           <w:i/>
           <w:sz w:val="19"/>
         </w:rPr>
-        <w:t>Source: Bannanje Govindacharya's Upanishad Discourses                                           Page 59</w:t>
+        <w:t>Source: Bannanje Govindacharya's Upaniṣad Discourses                                           Page 59</w:t>
       </w:r>
     </w:p>
     <w:p>
@@ -9883,7 +9883,7 @@
           <w:i/>
           <w:sz w:val="19"/>
         </w:rPr>
-        <w:t>Source: Bannanje Govindacharya's Upanishad Discourses                                           Page 60</w:t>
+        <w:t>Source: Bannanje Govindacharya's Upaniṣad Discourses                                           Page 60</w:t>
       </w:r>
     </w:p>
     <w:p>
@@ -10057,7 +10057,7 @@
         <w:jc w:val="left"/>
       </w:pPr>
       <w:r>
-        <w:t>This is one of the most profound shlokas of the Upanishad. The Lord is the One eternal among everything non-eternal. He is the consciousness in all conscious beings. He is the One who fulfils the desires of all. Those rare ones who see this Lord dwelling within themselves — they alone attain eternal peace.</w:t>
+        <w:t>This is one of the most profound ślokas of the Upaniṣad. The Lord is the One eternal among everything non-eternal. He is the consciousness in all conscious beings. He is the One who fulfils the desires of all. Those rare ones who see this Lord dwelling within themselves — they alone attain eternal peace.</w:t>
       </w:r>
     </w:p>
     <w:p>
@@ -10173,7 +10173,7 @@
           <w:i/>
           <w:sz w:val="19"/>
         </w:rPr>
-        <w:t>Source: Bannanje Govindacharya's Upanishad Discourses                                           Page 61</w:t>
+        <w:t>Source: Bannanje Govindacharya's Upaniṣad Discourses                                           Page 61</w:t>
       </w:r>
     </w:p>
     <w:p>
@@ -10201,7 +10201,7 @@
         <w:jc w:val="left"/>
       </w:pPr>
       <w:r>
-        <w:t>This key shloka prescribes the qualifications for both teacher and student. The teacher must be: (1) learned in scripture (shrotriya), and (2) established in Brahman (brahmanishtha). The student must approach with humility, carrying fuel as an offering — signifying readiness to serve. The student must have a completely peaceful mind and be endowed with tranquility. Without these qualities on both sides, true knowledge cannot be transmitted.</w:t>
+        <w:t>This key śloka prescribes the qualifications for both teacher and student. The teacher must be: (1) learned in scripture (shrotriya), and (2) established in Brahman (brahmaniṣṭhā). The student must approach with humility, carrying fuel as an offering — signifying readiness to serve. The student must have a completely peaceful mind and be endowed with tranquility. Without these qualities on both sides, true knowledge cannot be transmitted.</w:t>
       </w:r>
     </w:p>
     <w:p>
@@ -10309,7 +10309,7 @@
           <w:i/>
           <w:sz w:val="19"/>
         </w:rPr>
-        <w:t>Source: Bannanje Govindacharya's Upanishad Discourses                                           Page 65</w:t>
+        <w:t>Source: Bannanje Govindacharya's Upaniṣad Discourses                                           Page 65</w:t>
       </w:r>
     </w:p>
     <w:p>
@@ -10343,7 +10343,7 @@
           <w:i/>
           <w:sz w:val="22"/>
         </w:rPr>
-        <w:t>[Thus ends Katha Upanishad, Chapter 2, Valli 2.]</w:t>
+        <w:t>[Thus ends Katha Upaniṣad, Chapter 2, Vallī 2.]</w:t>
       </w:r>
     </w:p>
     <w:p>
@@ -10392,7 +10392,7 @@
         <w:jc w:val="left"/>
       </w:pPr>
       <w:r>
-        <w:t>Valli 03</w:t>
+        <w:t>Vallī 03</w:t>
       </w:r>
     </w:p>
     <w:p>
@@ -10494,7 +10494,7 @@
           <w:i/>
           <w:sz w:val="22"/>
         </w:rPr>
-        <w:t>[This is the eternal ashvattha tree with its root above and branches below. That alone is the pure; that is Brahman; that alone is called immortal. In it all the worlds rest; none transcends it. This verily is That. ||1||]</w:t>
+        <w:t>[This is the eternal aśvattha tree with its root above and branches below. That alone is the pure; that is Brahman; that alone is called immortal. In it all the worlds rest; none transcends it. This verily is That. ||1||]</w:t>
       </w:r>
     </w:p>
     <w:p>
@@ -10503,7 +10503,7 @@
         <w:jc w:val="left"/>
       </w:pPr>
       <w:r>
-        <w:t>The universe is compared to an Ashvattha tree (Peepal tree) with its roots above and branches below. The roots above mean the Lord is the source of all creation — above in the sense of being transcendent. The branches spread downward — meaning all of creation extends from that transcendent source. This same image appears in the Bhagavad Gita.</w:t>
+        <w:t>The universe is compared to an Aśvattha tree (Peepal tree) with its roots above and branches below. The roots above mean the Lord is the source of all creation — above in the sense of being transcendent. The branches spread downward — meaning all of creation extends from that transcendent source. This same image appears in the Bhagavad Gītā.</w:t>
       </w:r>
     </w:p>
     <w:p>
@@ -10576,7 +10576,7 @@
           <w:i/>
           <w:sz w:val="22"/>
         </w:rPr>
-        <w:t>[Whatever universe there is — all of it has emerged, trembling, from prana. It is a great terror, a raised thunderbolt. Those who know this become immortal. ||2||]</w:t>
+        <w:t>[Whatever universe there is — all of it has emerged, trembling, from prāṇa. It is a great terror, a raised thunderbolt. Those who know this become immortal. ||2||]</w:t>
       </w:r>
     </w:p>
     <w:p>
@@ -10590,7 +10590,7 @@
           <w:i/>
           <w:sz w:val="19"/>
         </w:rPr>
-        <w:t>Source: Bannanje Govindacharya's Upanishad Discourses                                           Page 66</w:t>
+        <w:t>Source: Bannanje Govindacharya's Upaniṣad Discourses                                           Page 66</w:t>
       </w:r>
     </w:p>
     <w:p>
@@ -10860,7 +10860,7 @@
           <w:i/>
           <w:sz w:val="19"/>
         </w:rPr>
-        <w:t>Source: Bannanje Govindacharya's Upanishad Discourses                                           Page 67</w:t>
+        <w:t>Source: Bannanje Govindacharya's Upaniṣad Discourses                                           Page 67</w:t>
       </w:r>
     </w:p>
     <w:p>
@@ -11092,7 +11092,7 @@
           <w:i/>
           <w:sz w:val="22"/>
         </w:rPr>
-        <w:t>[Beyond the senses is the mind; beyond the mind is the highest sattva (intellect). Beyond the intellect is the great Atman; beyond the great is the supreme Unmanifest. Beyond the Unmanifest is the Purusha, all-pervading and signless. Knowing Him, a creature is freed and attains immortality. ||7-8||]</w:t>
+        <w:t>[Beyond the senses is the mind; beyond the mind is the highest sattva (intellect). Beyond the intellect is the great Ātman; beyond the great is the supreme Unmanifest. Beyond the Unmanifest is the Puruṣa, all-pervading and signless. Knowing Him, a creature is freed and attains immortality. ||7-8||]</w:t>
       </w:r>
     </w:p>
     <w:p>
@@ -11179,7 +11179,7 @@
           <w:i/>
           <w:sz w:val="19"/>
         </w:rPr>
-        <w:t>Source: Bannanje Govindacharya's Upanishad Discourses                                           Page 68</w:t>
+        <w:t>Source: Bannanje Govindacharya's Upaniṣad Discourses                                           Page 68</w:t>
       </w:r>
     </w:p>
     <w:p>
@@ -11513,7 +11513,7 @@
           <w:i/>
           <w:sz w:val="19"/>
         </w:rPr>
-        <w:t>Source: Bannanje Govindacharya's Upanishad Discourses                                           Page 69</w:t>
+        <w:t>Source: Bannanje Govindacharya's Upaniṣad Discourses                                           Page 69</w:t>
       </w:r>
     </w:p>
     <w:p>
@@ -11541,7 +11541,7 @@
         <w:jc w:val="left"/>
       </w:pPr>
       <w:r>
-        <w:t>The souls that have died — do they continue? Do they have a new existence? The answer from Yama is clear: the soul continues. After leaving the physical body, the soul takes on a subtle form and goes to the realms appropriate to its karma. This is the fundamental teaching of the Katha Upanishad.</w:t>
+        <w:t>The souls that have died — do they continue? Do they have a new existence? The answer from Yama is clear: the soul continues. After leaving the physical body, the soul takes on a subtle form and goes to the realms appropriate to its karma. This is the fundamental teaching of the Katha Upaniṣad.</w:t>
       </w:r>
     </w:p>
     <w:p>
@@ -11710,7 +11710,7 @@
           <w:i/>
           <w:sz w:val="19"/>
         </w:rPr>
-        <w:t>Source: Bannanje Govindacharya's Upanishad Discourses                                           Page 70</w:t>
+        <w:t>Source: Bannanje Govindacharya's Upaniṣad Discourses                                           Page 70</w:t>
       </w:r>
     </w:p>
     <w:p>
@@ -11927,7 +11927,7 @@
           <w:i/>
           <w:sz w:val="19"/>
         </w:rPr>
-        <w:t>Source: Bannanje Govindacharya's Upanishad Discourses                                           Page 71</w:t>
+        <w:t>Source: Bannanje Govindacharya's Upaniṣad Discourses                                           Page 71</w:t>
       </w:r>
     </w:p>
     <w:p>
@@ -12028,7 +12028,7 @@
           <w:i/>
           <w:sz w:val="22"/>
         </w:rPr>
-        <w:t>[Nachiketa, having received this knowledge taught by Death, and the entire discipline of yoga, attained Brahman, became free from impurity and death. And so too will anyone else who knows thus about the Self. ||18||]</w:t>
+        <w:t>[Naciketā, having received this knowledge taught by Death, and the entire discipline of yoga, attained Brahman, became free from impurity and death. And so too will anyone else who knows thus about the Self. ||18||]</w:t>
       </w:r>
     </w:p>
     <w:p>
@@ -12037,7 +12037,7 @@
         <w:jc w:val="left"/>
       </w:pPr>
       <w:r>
-        <w:t>This is the concluding verse of the main teaching. Nachiketa, having received this priceless knowledge from Yama himself, attained Brahman — he became free from all impurity, free from death. And this promise extends to all: "Anyone else who knows thus about the Self" will also attain that same state. The teaching is universal and eternal.</w:t>
+        <w:t>This is the concluding verse of the main teaching. Naciketā, having received this priceless knowledge from Yama himself, attained Brahman — he became free from all impurity, free from death. And this promise extends to all: "Anyone else who knows thus about the Self" will also attain that same state. The teaching is universal and eternal.</w:t>
       </w:r>
     </w:p>
     <w:p>
@@ -12084,7 +12084,7 @@
           <w:i/>
           <w:sz w:val="19"/>
         </w:rPr>
-        <w:t>Source: Bannanje Govindacharya's Upanishad Discourses                                           Page 74</w:t>
+        <w:t>Source: Bannanje Govindacharya's Upaniṣad Discourses                                           Page 74</w:t>
       </w:r>
     </w:p>
     <w:p>
@@ -12214,7 +12214,7 @@
         <w:jc w:val="left"/>
       </w:pPr>
       <w:r>
-        <w:t>The peace mantra that opened this teaching now closes it. The teacher and student, having journeyed together through this profound knowledge, pray together for protection, nourishment, vigour in practice, brilliant understanding, and eternal harmony. Three repetitions of 'Shantih' — peace — address the three sources of suffering: disturbances from within oneself, from other beings, and from natural forces.</w:t>
+        <w:t>The peace mantra that opened this teaching now closes it. The teacher and student, having journeyed together through this profound knowledge, pray together for protection, nourishment, vigour in practice, brilliant understanding, and eternal harmony. Three repetitions of 'Śāntiḥ' — peace — address the three sources of suffering: disturbances from within oneself, from other beings, and from natural forces.</w:t>
       </w:r>
     </w:p>
     <w:p>
@@ -12235,7 +12235,7 @@
         <w:jc w:val="left"/>
       </w:pPr>
       <w:r>
-        <w:t>Thus ends the main commentary of the Katha Upanishad by Bannanje Govindacharya.</w:t>
+        <w:t>Thus ends the main commentary of the Katha Upaniṣad by Bannanje Govindacharya.</w:t>
       </w:r>
     </w:p>
     <w:p>
@@ -12249,7 +12249,7 @@
           <w:i/>
           <w:sz w:val="19"/>
         </w:rPr>
-        <w:t>Source: Bannanje Govindacharya's Upanishad Discourses                                           Page 75</w:t>
+        <w:t>Source: Bannanje Govindacharya's Upaniṣad Discourses                                           Page 75</w:t>
       </w:r>
     </w:p>
     <w:p>
@@ -12268,7 +12268,7 @@
           <w:b/>
           <w:sz w:val="26"/>
         </w:rPr>
-        <w:t>[PAGE 76 - ADHYAYA 2 TRITIYA VALLI - Shanti Mantra Exposition]</w:t>
+        <w:t>[PAGE 76 - ADHYAYA 2 TRITIYA VALLI - Śānti Mantra Exposition]</w:t>
       </w:r>
     </w:p>
     <w:p>
@@ -12286,7 +12286,7 @@
         <w:jc w:val="left"/>
       </w:pPr>
       <w:r>
-        <w:t>'Saha nau avatu': "O Lord, enter into my teacher and fill them with the power to teach; enter into me so that what the teacher says becomes comprehensible to me."</w:t>
+        <w:t>'saha nau avatu': "O Lord, enter into my teacher and fill them with the power to teach; enter into me so that what the teacher says becomes comprehensible to me."</w:t>
       </w:r>
     </w:p>
     <w:p>
@@ -12295,7 +12295,7 @@
         <w:jc w:val="left"/>
       </w:pPr>
       <w:r>
-        <w:t>'Saha nau bhanaktu': "O Lord, let there be no obstacle during our period of study. Let Your protection always be with us. Grant the prosperity needed for us both to eat and drink."</w:t>
+        <w:t>'saha nau bhunaktu': "O Lord, let there be no obstacle during our period of study. Let Your protection always be with us. Grant the prosperity needed for us both to eat and drink."</w:t>
       </w:r>
     </w:p>
     <w:p>
@@ -12304,7 +12304,7 @@
         <w:jc w:val="left"/>
       </w:pPr>
       <w:r>
-        <w:t>'Saha viryam karavavahai': "Grant the power to the Acharya to give us this spiritual knowledge and uplift us. Let our study remain effective. Grant us the ability to comprehend this knowledge and use it for the world's benefit."</w:t>
+        <w:t>'saha vīryaṃ karavāvahai': "Grant the power to the Acharya to give us this spiritual knowledge and uplift us. Let our study remain effective. Grant us the ability to comprehend this knowledge and use it for the world's benefit."</w:t>
       </w:r>
     </w:p>
     <w:p>
@@ -12313,7 +12313,7 @@
         <w:jc w:val="left"/>
       </w:pPr>
       <w:r>
-        <w:t>'Tejasvi navadhitamastu ma vidvishavahai': "Let the brilliance of our joint study manifest in us. Let the vitality to continue the knowledge through the disciple lineage come to us. Grant me the power to give what the teacher taught to the next generation. May neither of us ever hate the other; may we live with mutual love and respect."</w:t>
+        <w:t>'tejasvi nāvadhītamastu mā vidviṣāvahai': "Let the brilliance of our joint study manifest in us. Let the vitality to continue the knowledge through the disciple lineage come to us. Grant me the power to give what the teacher taught to the next generation. May neither of us ever hate the other; may we live with mutual love and respect."</w:t>
       </w:r>
     </w:p>
     <w:p>
@@ -12322,7 +12322,7 @@
         <w:jc w:val="left"/>
       </w:pPr>
       <w:r>
-        <w:t>Om Shantih Shantih Shantih: The Lord is the fullness of knowledge-bliss. Three repetitions denote His presence in all three Vedas, all three times, and everywhere.</w:t>
+        <w:t>Om Śāntiḥ Śāntiḥ Śāntiḥ: The Lord is the fullness of knowledge-bliss. Three repetitions denote His presence in all three Vedas, all three times, and everywhere.</w:t>
       </w:r>
     </w:p>
     <w:p>
@@ -12348,7 +12348,7 @@
           <w:i/>
           <w:sz w:val="19"/>
         </w:rPr>
-        <w:t>Source: Bannanje Govindacharya's Upanishad Discourses                                           Page 76</w:t>
+        <w:t>Source: Bannanje Govindacharya's Upaniṣad Discourses                                           Page 76</w:t>
       </w:r>
     </w:p>
     <w:p>
@@ -12409,7 +12409,7 @@
         <w:jc w:val="left"/>
       </w:pPr>
       <w:r>
-        <w:t>The Katha Upanishad belonging to the Krishna Yajurveda.</w:t>
+        <w:t>The Katha Upaniṣad belonging to the Krishna Yajurveda.</w:t>
       </w:r>
     </w:p>
     <w:p>
@@ -12418,7 +12418,7 @@
         <w:jc w:val="left"/>
       </w:pPr>
       <w:r>
-        <w:t>This Upanishad preserved by the noble sage Katha.</w:t>
+        <w:t>This Upaniṣad preserved by the noble sage Katha.</w:t>
       </w:r>
     </w:p>
     <w:p>
@@ -12427,7 +12427,7 @@
         <w:jc w:val="left"/>
       </w:pPr>
       <w:r>
-        <w:t>The dialogue of Yama and Nachiketa — one must listen with determination.</w:t>
+        <w:t>The dialogue of Yama and Naciketā — one must listen with determination.</w:t>
       </w:r>
     </w:p>
     <w:p>
@@ -12445,7 +12445,7 @@
         <w:jc w:val="left"/>
       </w:pPr>
       <w:r>
-        <w:t>For those wishing to know the truth — this Upanishad, the source of genuine knowledge.</w:t>
+        <w:t>For those wishing to know the truth — this Upaniṣad, the source of genuine knowledge.</w:t>
       </w:r>
     </w:p>
     <w:p>
@@ -12463,7 +12463,7 @@
         <w:jc w:val="left"/>
       </w:pPr>
       <w:r>
-        <w:t>To illumine this — the Upanishad emerged like a lamp.</w:t>
+        <w:t>To illumine this — the Upaniṣad emerged like a lamp.</w:t>
       </w:r>
     </w:p>
     <w:p>
@@ -12472,7 +12472,7 @@
         <w:jc w:val="left"/>
       </w:pPr>
       <w:r>
-        <w:t>The conversation between Yama of the other world and Nachiketa of this earth,</w:t>
+        <w:t>The conversation between Yama of the other world and Naciketā of this earth,</w:t>
       </w:r>
     </w:p>
     <w:p>
@@ -12508,7 +12508,7 @@
         <w:jc w:val="left"/>
       </w:pPr>
       <w:r>
-        <w:t>The name of the boy asking here is Nachiketa,</w:t>
+        <w:t>The name of the boy asking here is Naciketā,</w:t>
       </w:r>
     </w:p>
     <w:p>
@@ -12544,7 +12544,7 @@
         <w:jc w:val="left"/>
       </w:pPr>
       <w:r>
-        <w:t>Vajashravasa's daughter Aruna's son Uddhalaka,</w:t>
+        <w:t>Vājaśravasa's daughter Aruṇā's son Uddālaka,</w:t>
       </w:r>
     </w:p>
     <w:p>
@@ -12562,7 +12562,7 @@
         <w:jc w:val="left"/>
       </w:pPr>
       <w:r>
-        <w:t>Uddhalaka was engaged in study,</w:t>
+        <w:t>Uddālaka was engaged in study,</w:t>
       </w:r>
     </w:p>
     <w:p>
@@ -12580,7 +12580,7 @@
         <w:jc w:val="left"/>
       </w:pPr>
       <w:r>
-        <w:t>His two sons were Shvetaketu and Nachiketa;</w:t>
+        <w:t>His two sons were Śvetaketu and Naciketā;</w:t>
       </w:r>
     </w:p>
     <w:p>
@@ -12589,7 +12589,7 @@
         <w:jc w:val="left"/>
       </w:pPr>
       <w:r>
-        <w:t>Nachiketa was silent from childhood.</w:t>
+        <w:t>Naciketā was silent from childhood.</w:t>
       </w:r>
     </w:p>
     <w:p>
@@ -12621,7 +12621,7 @@
           <w:i/>
           <w:sz w:val="19"/>
         </w:rPr>
-        <w:t>Source: Bannanje Govindacharya's Upanishad Discourses                                           Page 77</w:t>
+        <w:t>Source: Bannanje Govindacharya's Upaniṣad Discourses                                           Page 77</w:t>
       </w:r>
     </w:p>
     <w:p>
@@ -12649,7 +12649,7 @@
         <w:jc w:val="left"/>
       </w:pPr>
       <w:r>
-        <w:t>This Nachiketa himself is one sage of the Upanishad,</w:t>
+        <w:t>This Naciketā himself is one sage of the Upaniṣad,</w:t>
       </w:r>
     </w:p>
     <w:p>
@@ -12690,7 +12690,7 @@
           <w:i/>
           <w:sz w:val="19"/>
         </w:rPr>
-        <w:t>Source: Bannanje Govindacharya's Upanishad Discourses                                           Page 78</w:t>
+        <w:t>Source: Bannanje Govindacharya's Upaniṣad Discourses                                           Page 78</w:t>
       </w:r>
     </w:p>
     <w:p>
@@ -12720,7 +12720,7 @@
           <w:i/>
           <w:sz w:val="22"/>
         </w:rPr>
-        <w:t>[The following sections contain the Kannada verse (padyarupa) retelling of the Katha Upanishad, covering all six Vallis across both Chapters, presented as devotional poetry. The original Kannada verse-form is a poetic paraphrase of the entire commentary, composed in rhyming Kannada couplets. Key themes covered:]</w:t>
+        <w:t>[The following sections contain the Kannada verse (padyarupa) retelling of the Katha Upaniṣad, covering all six Vallīs across both Chapters, presented as devotional poetry. The original Kannada verse-form is a poetic paraphrase of the entire commentary, composed in rhyming Kannada couplets. Key themes covered:]</w:t>
       </w:r>
     </w:p>
     <w:p>
@@ -12729,7 +12729,7 @@
         <w:jc w:val="left"/>
       </w:pPr>
       <w:r>
-        <w:t>Chapter 1, Valli 1 (Pages 79-97):</w:t>
+        <w:t>Chapter 1, Vallī 1 (Pages 79-97):</w:t>
       </w:r>
     </w:p>
     <w:p>
@@ -12738,7 +12738,7 @@
         <w:jc w:val="left"/>
       </w:pPr>
       <w:r>
-        <w:t>The story of Uddhalaka's yajna, Nachiketa's persistent questioning, his father's curse, journey to Yamaloka, waiting three days, Yama's offer of three boons, Nachiketa's three boons, and Yama's teaching of the Agni-vidya (knowledge of sacred fire). The verse form emphasises the moral lesson of Nachiketa's detachment and wisdom even as a child, and Yama's delight at finding such an earnest seeker.</w:t>
+        <w:t>The story of Uddālaka's yajña, Naciketā's persistent questioning, his father's curse, journey to Yamaloka, waiting three days, Yama's offer of three boons, Naciketā's three boons, and Yama's teaching of the Agni-vidyā (knowledge of sacred fire). The verse form emphasises the moral lesson of Naciketā's detachment and wisdom even as a child, and Yama's delight at finding such an earnest seeker.</w:t>
       </w:r>
     </w:p>
     <w:p>
@@ -12747,7 +12747,7 @@
         <w:jc w:val="left"/>
       </w:pPr>
       <w:r>
-        <w:t>Chapter 1, Valli 2 (Pages 98-111):</w:t>
+        <w:t>Chapter 1, Vallī 2 (Pages 98-111):</w:t>
       </w:r>
     </w:p>
     <w:p>
@@ -12756,7 +12756,7 @@
         <w:jc w:val="left"/>
       </w:pPr>
       <w:r>
-        <w:t>Yama's teaching on Shreyas versus Preyas (the beneficial versus the pleasant), the chariot metaphor of the body-self-intellect-mind-senses, the folly of those who seek only worldly pleasures, the rarity of true teachers and students, the syllable OM as the supreme symbol of Brahman, and Nachiketa's firm resolve against all temptations.</w:t>
+        <w:t>Yama's teaching on Śreyas versus Preyas (the beneficial versus the pleasant), the chariot metaphor of the body-self-intellect-mind-senses, the folly of those who seek only worldly pleasures, the rarity of true teachers and students, the syllable OM as the supreme symbol of Brahman, and Naciketā's firm resolve against all temptations.</w:t>
       </w:r>
     </w:p>
     <w:p>
@@ -12765,7 +12765,7 @@
         <w:jc w:val="left"/>
       </w:pPr>
       <w:r>
-        <w:t>Chapter 1, Valli 3 (Pages 112-120):</w:t>
+        <w:t>Chapter 1, Vallī 3 (Pages 112-120):</w:t>
       </w:r>
     </w:p>
     <w:p>
@@ -12774,7 +12774,7 @@
         <w:jc w:val="left"/>
       </w:pPr>
       <w:r>
-        <w:t>The two in the cave (Atma and AntarAtma), the chariot-metaphor elaborated, the hierarchy of creation from senses to Unmanifest to Purusha, the call 'Arise! Awake!' (uttishthata jagrata), the path difficult as a razor's edge, and the concluding blessing.</w:t>
+        <w:t>The two in the cave (Atma and AntarAtma), the chariot-metaphor elaborated, the hierarchy of creation from senses to Unmanifest to Puruṣa, the call 'Arise! Awake!' (uttishthata jagrata), the path difficult as a razor's edge, and the concluding blessing.</w:t>
       </w:r>
     </w:p>
     <w:p>
@@ -12783,7 +12783,7 @@
         <w:jc w:val="left"/>
       </w:pPr>
       <w:r>
-        <w:t>Chapter 2, Valli 1 (Pages 121-131):</w:t>
+        <w:t>Chapter 2, Vallī 1 (Pages 121-131):</w:t>
       </w:r>
     </w:p>
     <w:p>
@@ -12801,7 +12801,7 @@
         <w:jc w:val="left"/>
       </w:pPr>
       <w:r>
-        <w:t>Chapter 2, Valli 2 (Pages 132-141):</w:t>
+        <w:t>Chapter 2, Vallī 2 (Pages 132-141):</w:t>
       </w:r>
     </w:p>
     <w:p>
@@ -12810,7 +12810,7 @@
         <w:jc w:val="left"/>
       </w:pPr>
       <w:r>
-        <w:t>The city of eleven gates, the Lord as controller of prana-apana, the eternal among the non-eternal, the conscious among the conscious, the need for a qualified teacher, Brahman alone pervades all directions.</w:t>
+        <w:t>The city of eleven gates, the Lord as controller of prāṇa-apāna, the eternal among the non-eternal, the conscious among the conscious, the need for a qualified teacher, Brahman alone pervades all directions.</w:t>
       </w:r>
     </w:p>
     <w:p>
@@ -12819,7 +12819,7 @@
         <w:jc w:val="left"/>
       </w:pPr>
       <w:r>
-        <w:t>Chapter 2, Valli 3 (Pages 142-152):</w:t>
+        <w:t>Chapter 2, Vallī 3 (Pages 142-152):</w:t>
       </w:r>
     </w:p>
     <w:p>
@@ -12828,7 +12828,7 @@
         <w:jc w:val="left"/>
       </w:pPr>
       <w:r>
-        <w:t>The cosmic tree with roots above, the Lord as great terror who makes fire burn and sun shine, yoga as the stilling of senses and mind, the nadis of the heart, the path through the crown, the thumb-sized immortal Self, Nachiketa's attainment of Brahman.</w:t>
+        <w:t>The cosmic tree with roots above, the Lord as great terror who makes fire burn and sun shine, yoga as the stilling of senses and mind, the nadis of the heart, the path through the crown, the thumb-sized immortal Self, Naciketā's attainment of Brahman.</w:t>
       </w:r>
     </w:p>
     <w:p>
@@ -12842,7 +12842,7 @@
           <w:i/>
           <w:sz w:val="19"/>
         </w:rPr>
-        <w:t>Source: Bannanje Govindacharya's Upanishad Discourses                                           Pages 79-152</w:t>
+        <w:t>Source: Bannanje Govindacharya's Upaniṣad Discourses                                           Pages 79-152</w:t>
       </w:r>
     </w:p>
     <w:p>
@@ -12915,7 +12915,7 @@
         <w:jc w:val="left"/>
       </w:pPr>
       <w:r>
-        <w:t>|| Thus ends the Katha Upanishad in Kannada Verse Form ||</w:t>
+        <w:t>|| Thus ends the Katha Upaniṣad in Kannada Verse Form ||</w:t>
       </w:r>
     </w:p>
     <w:p>
@@ -12929,7 +12929,7 @@
           <w:i/>
           <w:sz w:val="19"/>
         </w:rPr>
-        <w:t>Source: Bannanje Govindacharya's Upanishad Discourses                                           Page 153</w:t>
+        <w:t>Source: Bannanje Govindacharya's Upaniṣad Discourses                                           Page 153</w:t>
       </w:r>
     </w:p>
     <w:p>
@@ -12959,7 +12959,7 @@
           <w:i/>
           <w:sz w:val="22"/>
         </w:rPr>
-        <w:t>[The following pages contain the original Sanskrit shlokas of the Katha Upanishad in Kannada script, presented as a reference text. These are the same shlokas that appear throughout the commentary above, here collected together in sequence.]</w:t>
+        <w:t>[The following pages contain the original Sanskrit ślokas of the Katha Upaniṣad in Kannada script, presented as a reference text. These are the same ślokas that appear throughout the commentary above, here collected together in sequence.]</w:t>
       </w:r>
     </w:p>
     <w:p>
@@ -12968,7 +12968,7 @@
         <w:jc w:val="left"/>
       </w:pPr>
       <w:r>
-        <w:t>CHAPTER 1, VALLI 1 — Sanskrit Shlokas (Pages 155-158)</w:t>
+        <w:t>CHAPTER 1, VALLI 1 — Sanskrit Ślokas (Pages 155-158)</w:t>
       </w:r>
     </w:p>
     <w:p>
@@ -13050,7 +13050,7 @@
           <w:i/>
           <w:sz w:val="22"/>
         </w:rPr>
-        <w:t>[Translation of all shlokas as given in the commentary sections above — Shloka 1 through 29 of Valli 1, Shlokas 1-25 of Valli 2, Shlokas 1-17 of Valli 3.]</w:t>
+        <w:t>[Translation of all ślokas as given in the commentary sections above — Śloka 1 through 29 of Vallī 1, Ślokas 1-25 of Vallī 2, Ślokas 1-17 of Vallī 3.]</w:t>
       </w:r>
     </w:p>
     <w:p>
@@ -13059,7 +13059,7 @@
         <w:jc w:val="left"/>
       </w:pPr>
       <w:r>
-        <w:t>CHAPTER 1, VALLI 2 — Sanskrit Shlokas (Pages 159-161)</w:t>
+        <w:t>CHAPTER 1, VALLI 2 — Sanskrit Ślokas (Pages 159-161)</w:t>
       </w:r>
     </w:p>
     <w:p>
@@ -13074,7 +13074,7 @@
           <w:i/>
           <w:sz w:val="22"/>
         </w:rPr>
-        <w:t>[Shlokas 1 through 25 — covering the Shreyas-Preyas teaching, the chariot metaphor, OM, and Nachiketa's firm resolve.]</w:t>
+        <w:t>[Ślokas 1 through 25 — covering the Śreyas-Preyas teaching, the chariot metaphor, OM, and Naciketā's firm resolve.]</w:t>
       </w:r>
     </w:p>
     <w:p>
@@ -13083,7 +13083,7 @@
         <w:jc w:val="left"/>
       </w:pPr>
       <w:r>
-        <w:t>CHAPTER 1, VALLI 3 — Sanskrit Shlokas (Pages 162-163)</w:t>
+        <w:t>CHAPTER 1, VALLI 3 — Sanskrit Ślokas (Pages 162-163)</w:t>
       </w:r>
     </w:p>
     <w:p>
@@ -13098,7 +13098,7 @@
           <w:i/>
           <w:sz w:val="22"/>
         </w:rPr>
-        <w:t>[Shlokas 1 through 17 — covering the two in the cave, the razor's edge path, the final blessing.]</w:t>
+        <w:t>[Ślokas 1 through 17 — covering the two in the cave, the razor's edge path, the final blessing.]</w:t>
       </w:r>
     </w:p>
     <w:p>
@@ -13107,7 +13107,7 @@
         <w:jc w:val="left"/>
       </w:pPr>
       <w:r>
-        <w:t>CHAPTER 2, VALLI 1 — Sanskrit Shlokas (Pages 164-165)</w:t>
+        <w:t>CHAPTER 2, VALLI 1 — Sanskrit Ślokas (Pages 164-165)</w:t>
       </w:r>
     </w:p>
     <w:p>
@@ -13122,7 +13122,7 @@
           <w:i/>
           <w:sz w:val="22"/>
         </w:rPr>
-        <w:t>[Shlokas 1 through 15 — covering the outward-turned senses, the inner self, 'This verily is That'.]</w:t>
+        <w:t>[Ślokas 1 through 15 — covering the outward-turned senses, the inner self, 'This verily is That'.]</w:t>
       </w:r>
     </w:p>
     <w:p>
@@ -13131,7 +13131,7 @@
         <w:jc w:val="left"/>
       </w:pPr>
       <w:r>
-        <w:t>CHAPTER 2, VALLI 2 — Sanskrit Shlokas (Pages 166-167)</w:t>
+        <w:t>CHAPTER 2, VALLI 2 — Sanskrit Ślokas (Pages 166-167)</w:t>
       </w:r>
     </w:p>
     <w:p>
@@ -13146,7 +13146,7 @@
           <w:i/>
           <w:sz w:val="22"/>
         </w:rPr>
-        <w:t>[Shlokas 1 through 15 — covering the city of eleven gates, fire-air-sun analogies, the eternal among the non-eternal.]</w:t>
+        <w:t>[Ślokas 1 through 15 — covering the city of eleven gates, fire-air-sun analogies, the eternal among the non-eternal.]</w:t>
       </w:r>
     </w:p>
     <w:p>
@@ -13155,7 +13155,7 @@
         <w:jc w:val="left"/>
       </w:pPr>
       <w:r>
-        <w:t>CHAPTER 2, VALLI 3 — Sanskrit Shlokas (Pages 168-170)</w:t>
+        <w:t>CHAPTER 2, VALLI 3 — Sanskrit Ślokas (Pages 168-170)</w:t>
       </w:r>
     </w:p>
     <w:p>
@@ -13170,7 +13170,7 @@
           <w:i/>
           <w:sz w:val="22"/>
         </w:rPr>
-        <w:t>[Shlokas 1 through 18 — covering the cosmic Ashvattha tree, yoga, the nadis, Nachiketa's liberation.]</w:t>
+        <w:t>[Ślokas 1 through 18 — covering the cosmic Aśvattha tree, yoga, the nadis, Naciketā's liberation.]</w:t>
       </w:r>
     </w:p>
     <w:p>
@@ -13184,7 +13184,7 @@
           <w:i/>
           <w:sz w:val="19"/>
         </w:rPr>
-        <w:t>Source: Bannanje Govindacharya's Upanishad Discourses                                           Pages 155-170</w:t>
+        <w:t>Source: Bannanje Govindacharya's Upaniṣad Discourses                                           Pages 155-170</w:t>
       </w:r>
     </w:p>
     <w:p>
@@ -13285,7 +13285,7 @@
           <w:i/>
           <w:sz w:val="22"/>
         </w:rPr>
-        <w:t>[Nachiketa, having received this knowledge taught by Death, and the entire discipline of yoga — attained Brahman, became free from impurity and death. And so too will anyone who knows thus about the Self.]</w:t>
+        <w:t>[Naciketā, having received this knowledge taught by Death, and the entire discipline of yoga — attained Brahman, became free from impurity and death. And so too will anyone who knows thus about the Self.]</w:t>
       </w:r>
     </w:p>
     <w:p>
@@ -13335,7 +13335,7 @@
         <w:jc w:val="left"/>
       </w:pPr>
       <w:r>
-        <w:t>Thus ends the Katha Upanishad.</w:t>
+        <w:t>Thus ends the Katha Upaniṣad.</w:t>
       </w:r>
     </w:p>
     <w:p>
@@ -13425,7 +13425,7 @@
           <w:i/>
           <w:sz w:val="19"/>
         </w:rPr>
-        <w:t>Source: Bannanje Govindacharya's Upanishad Discourses                                           Page 170</w:t>
+        <w:t>Source: Bannanje Govindacharya's Upaniṣad Discourses                                           Page 170</w:t>
       </w:r>
     </w:p>
     <w:sectPr>

</xml_diff>